<commit_message>
feat(group-08): SkyHydro disaster relief UAV capstone submission (PR #1)
Approved Capstone Phase implementation for Group 08: Manikya Rathore (E056), Shourya Garg (E020), Keswani Laksh (E032), Vora Jash (E067).
</commit_message>
<xml_diff>
--- a/Group_08_Manikya_Shourya_Keswani_Vora/docs/MDRIIA_Group_08_Technical_Dossier.docx
+++ b/Group_08_Manikya_Shourya_Keswani_Vora/docs/MDRIIA_Group_08_Technical_Dossier.docx
@@ -1323,7 +1323,7 @@
                     <w:sz w:val="14"/>
                     <w:szCs w:val="14"/>
                   </w:rPr>
-                  <w:t xml:space="preserve">type here</w:t>
+                  <w:t xml:space="preserve">No primary NDRF/SDMA source found for 6–8 sorties/drone/day. Replaced by our computed cycle: 31 min per sortie (5 km corridor, 8 m/s cruise, sim-measured drop-site time, 10 min battery swap) → 23 sorties/UAV in a 12 h window; an assumption-driven output varied in the sensitivity graph.</w:t>
                 </w:r>
               </w:sdtContent>
             </w:sdt>
@@ -1363,7 +1363,7 @@
                     <w:sz w:val="14"/>
                     <w:szCs w:val="14"/>
                   </w:rPr>
-                  <w:t xml:space="preserve">Select ▾</w:t>
+                  <w:t xml:space="preserve">No source found</w:t>
                 </w:r>
               </w:sdtContent>
             </w:sdt>
@@ -1400,7 +1400,7 @@
                     <w:sz w:val="14"/>
                     <w:szCs w:val="14"/>
                   </w:rPr>
-                  <w:t xml:space="preserve">Select ▾</w:t>
+                  <w:t xml:space="preserve">Correct</w:t>
                 </w:r>
               </w:sdtContent>
             </w:sdt>
@@ -1480,7 +1480,7 @@
                     <w:sz w:val="14"/>
                     <w:szCs w:val="14"/>
                   </w:rPr>
-                  <w:t xml:space="preserve">type here</w:t>
+                  <w:t xml:space="preserve">No source found for '85 %'. Computed by our model (analytics/disaster_relief_logistics.py): response latency UAV 34 min vs boat 222 min (M/M/c wait + outbound leg) = 85 % reduction under our labelled assumptions; reported as a model output, not a fact.</w:t>
                 </w:r>
               </w:sdtContent>
             </w:sdt>
@@ -1520,7 +1520,7 @@
                     <w:sz w:val="14"/>
                     <w:szCs w:val="14"/>
                   </w:rPr>
-                  <w:t xml:space="preserve">Select ▾</w:t>
+                  <w:t xml:space="preserve">No source found</w:t>
                 </w:r>
               </w:sdtContent>
             </w:sdt>
@@ -1557,7 +1557,7 @@
                     <w:sz w:val="14"/>
                     <w:szCs w:val="14"/>
                   </w:rPr>
-                  <w:t xml:space="preserve">Select ▾</w:t>
+                  <w:t xml:space="preserve">Correct</w:t>
                 </w:r>
               </w:sdtContent>
             </w:sdt>
@@ -1634,7 +1634,7 @@
                     <w:sz w:val="14"/>
                     <w:szCs w:val="14"/>
                   </w:rPr>
-                  <w:t xml:space="preserve">type here</w:t>
+                  <w:t xml:space="preserve">Central Water Commission (FFM Dte.), 'State-wise flood damage statistics, 1953–2016', letter dt. 10-05-2018, cwc.gov.in/sites/default/files/statewiseflooddatadamagestatistics.pdf: yearly average 31.88 million people affected, 12.42 lakh houses damaged, 1,648 lives lost. No NDRF boat-operation figure could be verified, so none is used.</w:t>
                 </w:r>
               </w:sdtContent>
             </w:sdt>
@@ -1673,7 +1673,7 @@
                     <w:sz w:val="14"/>
                     <w:szCs w:val="14"/>
                   </w:rPr>
-                  <w:t xml:space="preserve">Select ▾</w:t>
+                  <w:t xml:space="preserve">Government / official report</w:t>
                 </w:r>
               </w:sdtContent>
             </w:sdt>
@@ -1709,7 +1709,7 @@
                     <w:sz w:val="14"/>
                     <w:szCs w:val="14"/>
                   </w:rPr>
-                  <w:t xml:space="preserve">Select ▾</w:t>
+                  <w:t xml:space="preserve">Correct</w:t>
                 </w:r>
               </w:sdtContent>
             </w:sdt>
@@ -1980,7 +1980,7 @@
                     <w:sz w:val="14"/>
                     <w:szCs w:val="14"/>
                   </w:rPr>
-                  <w:t xml:space="preserve">Select ▾</w:t>
+                  <w:t xml:space="preserve">No</w:t>
                 </w:r>
               </w:sdtContent>
             </w:sdt>
@@ -2012,7 +2012,7 @@
                     <w:sz w:val="14"/>
                     <w:szCs w:val="14"/>
                   </w:rPr>
-                  <w:t xml:space="preserve">type here</w:t>
+                  <w:t xml:space="preserve">Covers industrial robot arms in a factory cell (ISO 10218-1/-2:2011); SkyHydro is an aerial vehicle in open flood terrain.</w:t>
                 </w:r>
               </w:sdtContent>
             </w:sdt>
@@ -2117,7 +2117,7 @@
                     <w:sz w:val="14"/>
                     <w:szCs w:val="14"/>
                   </w:rPr>
-                  <w:t xml:space="preserve">Select ▾</w:t>
+                  <w:t xml:space="preserve">No</w:t>
                 </w:r>
               </w:sdtContent>
             </w:sdt>
@@ -2149,7 +2149,7 @@
                     <w:sz w:val="14"/>
                     <w:szCs w:val="14"/>
                   </w:rPr>
-                  <w:t xml:space="preserve">type here</w:t>
+                  <w:t xml:space="preserve">Driverless industrial trucks / AMRs on the ground (ISO 3691-4:2020); not an aircraft.</w:t>
                 </w:r>
               </w:sdtContent>
             </w:sdt>
@@ -2254,7 +2254,7 @@
                     <w:sz w:val="14"/>
                     <w:szCs w:val="14"/>
                   </w:rPr>
-                  <w:t xml:space="preserve">Select ▾</w:t>
+                  <w:t xml:space="preserve">No</w:t>
                 </w:r>
               </w:sdtContent>
             </w:sdt>
@@ -2286,7 +2286,7 @@
                     <w:sz w:val="14"/>
                     <w:szCs w:val="14"/>
                   </w:rPr>
-                  <w:t xml:space="preserve">type here</w:t>
+                  <w:t xml:space="preserve">US adoption of ISO 10218 for industrial robots; neither the robot type nor the jurisdiction applies.</w:t>
                 </w:r>
               </w:sdtContent>
             </w:sdt>
@@ -2391,7 +2391,7 @@
                     <w:sz w:val="14"/>
                     <w:szCs w:val="14"/>
                   </w:rPr>
-                  <w:t xml:space="preserve">Select ▾</w:t>
+                  <w:t xml:space="preserve">No</w:t>
                 </w:r>
               </w:sdtContent>
             </w:sdt>
@@ -2423,7 +2423,7 @@
                     <w:sz w:val="14"/>
                     <w:szCs w:val="14"/>
                   </w:rPr>
-                  <w:t xml:space="preserve">type here</w:t>
+                  <w:t xml:space="preserve">The UAV carries packaged medicines but is not medical electrical equipment applied to a patient (IEC 60601-1:2005+A2:2020).</w:t>
                 </w:r>
               </w:sdtContent>
             </w:sdt>
@@ -2524,7 +2524,7 @@
                     <w:sz w:val="14"/>
                     <w:szCs w:val="14"/>
                   </w:rPr>
-                  <w:t xml:space="preserve">Select ▾</w:t>
+                  <w:t xml:space="preserve">Yes</w:t>
                 </w:r>
               </w:sdtContent>
             </w:sdt>
@@ -2555,7 +2555,7 @@
                     <w:sz w:val="14"/>
                     <w:szCs w:val="14"/>
                   </w:rPr>
-                  <w:t xml:space="preserve">type here</w:t>
+                  <w:t xml:space="preserve">Drone Rules, 2021 (MoCA, notified 25-08-2021): R.5 'small' class 2–25 kg AUW incl. payload (ours 4.4–6.4 kg); R.19/22 airspace map, green zone ≤ 120 m AGL (we fly ≤ 18 m), red/yellow need permission; R.28 dangerous goods (Li cells, some medicines); R.31 licensed remote pilot. No payload-drop or BVLOS clause, so we winch to 1 m above the roof and assume a R.48 exemption.</w:t>
                 </w:r>
               </w:sdtContent>
             </w:sdt>
@@ -2647,7 +2647,7 @@
                     <w:sz w:val="15"/>
                     <w:szCs w:val="15"/>
                   </w:rPr>
-                  <w:t xml:space="preserve">type here</w:t>
+                  <w:t xml:space="preserve">Urgent kit sent by a dedicated rescue boat: response latency 222 min and 105 min boat round trip for a 5 km corridor (modelled); scale: 31.88 million people flood-affected per year in India.</w:t>
                 </w:r>
               </w:sdtContent>
             </w:sdt>
@@ -2706,7 +2706,7 @@
                     <w:sz w:val="15"/>
                     <w:szCs w:val="15"/>
                   </w:rPr>
-                  <w:t xml:space="preserve">type here</w:t>
+                  <w:t xml:space="preserve">Scale: CWC flood damage statistics 1953–2016 (2018), cwc.gov.in/…/statewiseflooddatadamagestatistics.pdf. Boat speed 8 km/h and 30 min launch are labelled assumptions (no verified NDRF value), varied ±30 %.</w:t>
                 </w:r>
               </w:sdtContent>
             </w:sdt>
@@ -2763,7 +2763,7 @@
                     <w:sz w:val="15"/>
                     <w:szCs w:val="15"/>
                   </w:rPr>
-                  <w:t xml:space="preserve">type here</w:t>
+                  <w:t xml:space="preserve">NDRF/SDRF boat crews (crew-hours per urgent run), district disaster-management authority (fleet cost), stranded households (waiting time).</w:t>
                 </w:r>
               </w:sdtContent>
             </w:sdt>
@@ -3209,7 +3209,7 @@
                     <w:sz w:val="15"/>
                     <w:szCs w:val="15"/>
                   </w:rPr>
-                  <w:t xml:space="preserve">type here</w:t>
+                  <w:t xml:space="preserve">0.002 s (500 Hz), RK4; controller and logger also run every step (500 Hz)</w:t>
                 </w:r>
               </w:sdtContent>
             </w:sdt>
@@ -3268,7 +3268,7 @@
                     <w:sz w:val="15"/>
                     <w:szCs w:val="15"/>
                   </w:rPr>
-                  <w:t xml:space="preserve">type here</w:t>
+                  <w:t xml:space="preserve">0.7 / 0.01 / 0.001 (rubberised canister base on a concrete roof)</w:t>
                 </w:r>
               </w:sdtContent>
             </w:sdt>
@@ -3327,7 +3327,7 @@
                     <w:sz w:val="15"/>
                     <w:szCs w:val="15"/>
                   </w:rPr>
-                  <w:t xml:space="preserve">type here</w:t>
+                  <w:t xml:space="preserve">0.01 1: 10 ms time constant = 5 timesteps (MuJoCo needs ≥ 2·dt) and damping ratio 1, so the canister lands without bouncing; at 0.005 it nears the 2·dt limit and the landing jitters.</w:t>
                 </w:r>
               </w:sdtContent>
             </w:sdt>
@@ -3394,7 +3394,7 @@
                     <w:sz w:val="15"/>
                     <w:szCs w:val="15"/>
                   </w:rPr>
-                  <w:t xml:space="preserve">Select ▾</w:t>
+                  <w:t xml:space="preserve">PID</w:t>
                 </w:r>
               </w:sdtContent>
             </w:sdt>
@@ -3453,7 +3453,7 @@
                     <w:sz w:val="15"/>
                     <w:szCs w:val="15"/>
                   </w:rPr>
-                  <w:t xml:space="preserve">type here</w:t>
+                  <w:t xml:space="preserve">Cascaded PID: position Kp 1.2/1.2/1.5 s⁻¹, Ki 0.35/0.35/0.4 s⁻² (proposed only); velocity Kv 2.5/2.5/3.0 s⁻¹; attitude kR 7.0 N·m/rad, kω 1.1 N·m·s/rad; anti-sway 0.6 (–); canister centring 0.35 s⁻¹; tilt ≤ 35°; winch servo kp 600 N/m, kv 80 N·s/m</w:t>
                 </w:r>
               </w:sdtContent>
             </w:sdt>
@@ -3512,7 +3512,7 @@
                     <w:sz w:val="15"/>
                     <w:szCs w:val="15"/>
                   </w:rPr>
-                  <w:t xml:space="preserve">type here</w:t>
+                  <w:t xml:space="preserve">TAKEOFF, CRUISE, APPROACH_DROP_ZONE, HOVER, WINCH_LOWER, RELEASE, WINCH_UP, RETURN_TO_BASE, ABORT (no steady window / battery reserve &lt; 25 %)</w:t>
                 </w:r>
               </w:sdtContent>
             </w:sdt>
@@ -3573,7 +3573,7 @@
                     <w:sz w:val="15"/>
                     <w:szCs w:val="15"/>
                   </w:rPr>
-                  <w:t xml:space="preserve">Select ▾</w:t>
+                  <w:t xml:space="preserve">Yes</w:t>
                 </w:r>
               </w:sdtContent>
             </w:sdt>
@@ -3780,7 +3780,7 @@
                     <w:sz w:val="14"/>
                     <w:szCs w:val="14"/>
                   </w:rPr>
-                  <w:t xml:space="preserve">Select ▾</w:t>
+                  <w:t xml:space="preserve">Modified by us</w:t>
                 </w:r>
               </w:sdtContent>
             </w:sdt>
@@ -3819,7 +3819,7 @@
                     <w:sz w:val="14"/>
                     <w:szCs w:val="14"/>
                   </w:rPr>
-                  <w:t xml:space="preserve">Select ▾</w:t>
+                  <w:t xml:space="preserve">E056</w:t>
                 </w:r>
               </w:sdtContent>
             </w:sdt>
@@ -3851,7 +3851,7 @@
                     <w:sz w:val="14"/>
                     <w:szCs w:val="14"/>
                   </w:rPr>
-                  <w:t xml:space="preserve">type here</w:t>
+                  <w:t xml:space="preserve">Fixed invalid &lt;motor body&gt;; 4 rotor sites (differential thrust + drag torque), winch slide + releasable canister, roof target</w:t>
                 </w:r>
               </w:sdtContent>
             </w:sdt>
@@ -3915,7 +3915,7 @@
                     <w:sz w:val="14"/>
                     <w:szCs w:val="14"/>
                   </w:rPr>
-                  <w:t xml:space="preserve">Select ▾</w:t>
+                  <w:t xml:space="preserve">Written by us</w:t>
                 </w:r>
               </w:sdtContent>
             </w:sdt>
@@ -3954,7 +3954,7 @@
                     <w:sz w:val="14"/>
                     <w:szCs w:val="14"/>
                   </w:rPr>
-                  <w:t xml:space="preserve">Select ▾</w:t>
+                  <w:t xml:space="preserve">Shared</w:t>
                 </w:r>
               </w:sdtContent>
             </w:sdt>
@@ -3986,7 +3986,7 @@
                     <w:sz w:val="14"/>
                     <w:szCs w:val="14"/>
                   </w:rPr>
-                  <w:t xml:space="preserve">type here</w:t>
+                  <w:t xml:space="preserve">Replaced the kinematic toy with MuJoCo closed loop: FSM, cascaded PID, wind/gusts, vision release, Monte Carlo, 500 Hz log</w:t>
                 </w:r>
               </w:sdtContent>
             </w:sdt>
@@ -4050,7 +4050,7 @@
                     <w:sz w:val="14"/>
                     <w:szCs w:val="14"/>
                   </w:rPr>
-                  <w:t xml:space="preserve">Select ▾</w:t>
+                  <w:t xml:space="preserve">Written by us</w:t>
                 </w:r>
               </w:sdtContent>
             </w:sdt>
@@ -4089,7 +4089,7 @@
                     <w:sz w:val="14"/>
                     <w:szCs w:val="14"/>
                   </w:rPr>
-                  <w:t xml:space="preserve">Select ▾</w:t>
+                  <w:t xml:space="preserve">E067</w:t>
                 </w:r>
               </w:sdtContent>
             </w:sdt>
@@ -4121,7 +4121,7 @@
                     <w:sz w:val="14"/>
                     <w:szCs w:val="14"/>
                   </w:rPr>
-                  <w:t xml:space="preserve">type here</w:t>
+                  <w:t xml:space="preserve">Hard-coded outputs replaced by computed H, κ/NCRI, P_payback, M/M/c, FMEA, ±30 % sensitivity from sim + labelled inputs</w:t>
                 </w:r>
               </w:sdtContent>
             </w:sdt>
@@ -4158,7 +4158,7 @@
                     <w:sz w:val="14"/>
                     <w:szCs w:val="14"/>
                   </w:rPr>
-                  <w:t xml:space="preserve">type here</w:t>
+                  <w:t xml:space="preserve">analytics/analyze_trials.py</w:t>
                 </w:r>
               </w:sdtContent>
             </w:sdt>
@@ -4196,7 +4196,7 @@
                     <w:sz w:val="14"/>
                     <w:szCs w:val="14"/>
                   </w:rPr>
-                  <w:t xml:space="preserve">Select ▾</w:t>
+                  <w:t xml:space="preserve">Written by us</w:t>
                 </w:r>
               </w:sdtContent>
             </w:sdt>
@@ -4235,7 +4235,7 @@
                     <w:sz w:val="14"/>
                     <w:szCs w:val="14"/>
                   </w:rPr>
-                  <w:t xml:space="preserve">Select ▾</w:t>
+                  <w:t xml:space="preserve">E032</w:t>
                 </w:r>
               </w:sdtContent>
             </w:sdt>
@@ -4267,7 +4267,7 @@
                     <w:sz w:val="14"/>
                     <w:szCs w:val="14"/>
                   </w:rPr>
-                  <w:t xml:space="preserve">type here</w:t>
+                  <w:t xml:space="preserve">Welch t-test, Cohen's d, 95 % CI, CEP, box + trajectory plots from *_real_trials.csv</w:t>
                 </w:r>
               </w:sdtContent>
             </w:sdt>
@@ -4303,7 +4303,7 @@
                     <w:sz w:val="14"/>
                     <w:szCs w:val="14"/>
                   </w:rPr>
-                  <w:t xml:space="preserve">type here</w:t>
+                  <w:t xml:space="preserve">simulate.py, environment/, rl/</w:t>
                 </w:r>
               </w:sdtContent>
             </w:sdt>
@@ -4340,7 +4340,7 @@
                     <w:sz w:val="14"/>
                     <w:szCs w:val="14"/>
                   </w:rPr>
-                  <w:t xml:space="preserve">Select ▾</w:t>
+                  <w:t xml:space="preserve">Written by us</w:t>
                 </w:r>
               </w:sdtContent>
             </w:sdt>
@@ -4378,7 +4378,7 @@
                     <w:sz w:val="14"/>
                     <w:szCs w:val="14"/>
                   </w:rPr>
-                  <w:t xml:space="preserve">Select ▾</w:t>
+                  <w:t xml:space="preserve">E056</w:t>
                 </w:r>
               </w:sdtContent>
             </w:sdt>
@@ -4409,7 +4409,7 @@
                     <w:sz w:val="14"/>
                     <w:szCs w:val="14"/>
                   </w:rPr>
-                  <w:t xml:space="preserve">type here</w:t>
+                  <w:t xml:space="preserve">3D valley, animated water, PPO pilot (stages 1–3): stage 3 completed 30/30 missions, 150 s vs 309 s expert (rl_pilot_real_trials.csv)</w:t>
                 </w:r>
               </w:sdtContent>
             </w:sdt>
@@ -4450,7 +4450,7 @@
       </w:tblGrid>
       <w:tr>
         <w:trPr>
-          <w:trHeight w:val="2608" w:hRule="exact"/>
+          <w:trHeight w:val="2608" w:hRule="atLeast"/>
           <w:cantSplit/>
         </w:trPr>
         <w:tc>
@@ -4462,15 +4462,363 @@
               <w:spacing w:after="0"/>
               <w:jc w:val="center"/>
             </w:pPr>
-            <w:r/>
             <w:r>
               <w:rPr>
+                <w:b/>
+                <w:i w:val="0"/>
+                <w:sz w:val="14"/>
+              </w:rPr>
+              <w:t>src/flood_relief_drop_sim.py, lines 262–286  (FSM transitions: HOVER → WINCH_LOWER → RELEASE / ABORT)</w:t>
+            </w:r>
+          </w:p>
+          <w:p>
+            <w:pPr>
+              <w:spacing w:after="0" w:before="0" w:line="240" w:lineRule="auto"/>
+            </w:pPr>
+            <w:r>
+              <w:rPr>
+                <w:rFonts w:ascii="Consolas" w:hAnsi="Consolas" w:eastAsia="Consolas"/>
                 <w:b w:val="0"/>
-                <w:i/>
-                <w:color w:val="595959"/>
-                <w:sz w:val="15"/>
+                <w:i w:val="0"/>
+                <w:sz w:val="16"/>
               </w:rPr>
-              <w:t>[ Paste code as text (Consolas 8 pt), not a screenshot. Include the file name and line numbers. ]</w:t>
+              <w:t xml:space="preserve"> 262          elif s == "HOVER":</w:t>
+            </w:r>
+          </w:p>
+          <w:p>
+            <w:pPr>
+              <w:spacing w:after="0" w:before="0" w:line="240" w:lineRule="auto"/>
+            </w:pPr>
+            <w:r>
+              <w:rPr>
+                <w:rFonts w:ascii="Consolas" w:hAnsi="Consolas" w:eastAsia="Consolas"/>
+                <w:b w:val="0"/>
+                <w:i w:val="0"/>
+                <w:sz w:val="16"/>
+              </w:rPr>
+              <w:t xml:space="preserve"> 263              if self.ctrl_name == "baseline":</w:t>
+            </w:r>
+          </w:p>
+          <w:p>
+            <w:pPr>
+              <w:spacing w:after="0" w:before="0" w:line="240" w:lineRule="auto"/>
+            </w:pPr>
+            <w:r>
+              <w:rPr>
+                <w:rFonts w:ascii="Consolas" w:hAnsi="Consolas" w:eastAsia="Consolas"/>
+                <w:b w:val="0"/>
+                <w:i w:val="0"/>
+                <w:sz w:val="16"/>
+              </w:rPr>
+              <w:t xml:space="preserve"> 264                  ok = err &lt; 0.5 and np.linalg.norm(v) &lt; 0.5</w:t>
+            </w:r>
+          </w:p>
+          <w:p>
+            <w:pPr>
+              <w:spacing w:after="0" w:before="0" w:line="240" w:lineRule="auto"/>
+            </w:pPr>
+            <w:r>
+              <w:rPr>
+                <w:rFonts w:ascii="Consolas" w:hAnsi="Consolas" w:eastAsia="Consolas"/>
+                <w:b w:val="0"/>
+                <w:i w:val="0"/>
+                <w:sz w:val="16"/>
+              </w:rPr>
+              <w:t xml:space="preserve"> 265              else:</w:t>
+            </w:r>
+          </w:p>
+          <w:p>
+            <w:pPr>
+              <w:spacing w:after="0" w:before="0" w:line="240" w:lineRule="auto"/>
+            </w:pPr>
+            <w:r>
+              <w:rPr>
+                <w:rFonts w:ascii="Consolas" w:hAnsi="Consolas" w:eastAsia="Consolas"/>
+                <w:b w:val="0"/>
+                <w:i w:val="0"/>
+                <w:sz w:val="16"/>
+              </w:rPr>
+              <w:t xml:space="preserve"> 266                  ok = np.linalg.norm(self.est_err) &lt; 0.6 and np.linalg.norm(v) &lt; 0.5</w:t>
+            </w:r>
+          </w:p>
+          <w:p>
+            <w:pPr>
+              <w:spacing w:after="0" w:before="0" w:line="240" w:lineRule="auto"/>
+            </w:pPr>
+            <w:r>
+              <w:rPr>
+                <w:rFonts w:ascii="Consolas" w:hAnsi="Consolas" w:eastAsia="Consolas"/>
+                <w:b w:val="0"/>
+                <w:i w:val="0"/>
+                <w:sz w:val="16"/>
+              </w:rPr>
+              <w:t xml:space="preserve"> 267              if (ok and ts &gt; 1.0) or ts &gt; 15.0:</w:t>
+            </w:r>
+          </w:p>
+          <w:p>
+            <w:pPr>
+              <w:spacing w:after="0" w:before="0" w:line="240" w:lineRule="auto"/>
+            </w:pPr>
+            <w:r>
+              <w:rPr>
+                <w:rFonts w:ascii="Consolas" w:hAnsi="Consolas" w:eastAsia="Consolas"/>
+                <w:b w:val="0"/>
+                <w:i w:val="0"/>
+                <w:sz w:val="16"/>
+              </w:rPr>
+              <w:t xml:space="preserve"> 268                  self.set_state("WINCH_LOWER")</w:t>
+            </w:r>
+          </w:p>
+          <w:p>
+            <w:pPr>
+              <w:spacing w:after="0" w:before="0" w:line="240" w:lineRule="auto"/>
+            </w:pPr>
+            <w:r>
+              <w:rPr>
+                <w:rFonts w:ascii="Consolas" w:hAnsi="Consolas" w:eastAsia="Consolas"/>
+                <w:b w:val="0"/>
+                <w:i w:val="0"/>
+                <w:sz w:val="16"/>
+              </w:rPr>
+              <w:t xml:space="preserve"> 269          elif s == "WINCH_LOWER":</w:t>
+            </w:r>
+          </w:p>
+          <w:p>
+            <w:pPr>
+              <w:spacing w:after="0" w:before="0" w:line="240" w:lineRule="auto"/>
+            </w:pPr>
+            <w:r>
+              <w:rPr>
+                <w:rFonts w:ascii="Consolas" w:hAnsi="Consolas" w:eastAsia="Consolas"/>
+                <w:b w:val="0"/>
+                <w:i w:val="0"/>
+                <w:sz w:val="16"/>
+              </w:rPr>
+              <w:t xml:space="preserve"> 270              if self.d.qpos[self.q_winch] &gt;= self.winch_target - 0.03:</w:t>
+            </w:r>
+          </w:p>
+          <w:p>
+            <w:pPr>
+              <w:spacing w:after="0" w:before="0" w:line="240" w:lineRule="auto"/>
+            </w:pPr>
+            <w:r>
+              <w:rPr>
+                <w:rFonts w:ascii="Consolas" w:hAnsi="Consolas" w:eastAsia="Consolas"/>
+                <w:b w:val="0"/>
+                <w:i w:val="0"/>
+                <w:sz w:val="16"/>
+              </w:rPr>
+              <w:t xml:space="preserve"> 271                  self.set_state("RELEASE")</w:t>
+            </w:r>
+          </w:p>
+          <w:p>
+            <w:pPr>
+              <w:spacing w:after="0" w:before="0" w:line="240" w:lineRule="auto"/>
+            </w:pPr>
+            <w:r>
+              <w:rPr>
+                <w:rFonts w:ascii="Consolas" w:hAnsi="Consolas" w:eastAsia="Consolas"/>
+                <w:b w:val="0"/>
+                <w:i w:val="0"/>
+                <w:sz w:val="16"/>
+              </w:rPr>
+              <w:t xml:space="preserve"> 272          elif s == "RELEASE":</w:t>
+            </w:r>
+          </w:p>
+          <w:p>
+            <w:pPr>
+              <w:spacing w:after="0" w:before="0" w:line="240" w:lineRule="auto"/>
+            </w:pPr>
+            <w:r>
+              <w:rPr>
+                <w:rFonts w:ascii="Consolas" w:hAnsi="Consolas" w:eastAsia="Consolas"/>
+                <w:b w:val="0"/>
+                <w:i w:val="0"/>
+                <w:sz w:val="16"/>
+              </w:rPr>
+              <w:t xml:space="preserve"> 273              if self.ctrl_name == "baseline":</w:t>
+            </w:r>
+          </w:p>
+          <w:p>
+            <w:pPr>
+              <w:spacing w:after="0" w:before="0" w:line="240" w:lineRule="auto"/>
+            </w:pPr>
+            <w:r>
+              <w:rPr>
+                <w:rFonts w:ascii="Consolas" w:hAnsi="Consolas" w:eastAsia="Consolas"/>
+                <w:b w:val="0"/>
+                <w:i w:val="0"/>
+                <w:sz w:val="16"/>
+              </w:rPr>
+              <w:t xml:space="preserve"> 274                  go = True                                         # timed release at the waypoint</w:t>
+            </w:r>
+          </w:p>
+          <w:p>
+            <w:pPr>
+              <w:spacing w:after="0" w:before="0" w:line="240" w:lineRule="auto"/>
+            </w:pPr>
+            <w:r>
+              <w:rPr>
+                <w:rFonts w:ascii="Consolas" w:hAnsi="Consolas" w:eastAsia="Consolas"/>
+                <w:b w:val="0"/>
+                <w:i w:val="0"/>
+                <w:sz w:val="16"/>
+              </w:rPr>
+              <w:t xml:space="preserve"> 275              else:</w:t>
+            </w:r>
+          </w:p>
+          <w:p>
+            <w:pPr>
+              <w:spacing w:after="0" w:before="0" w:line="240" w:lineRule="auto"/>
+            </w:pPr>
+            <w:r>
+              <w:rPr>
+                <w:rFonts w:ascii="Consolas" w:hAnsi="Consolas" w:eastAsia="Consolas"/>
+                <w:b w:val="0"/>
+                <w:i w:val="0"/>
+                <w:sz w:val="16"/>
+              </w:rPr>
+              <w:t xml:space="preserve"> 276                  go = (np.linalg.norm(self.est_err) &lt; REL_ERR and np.linalg.norm(self.est_rel_v) &lt; REL_SPD)</w:t>
+            </w:r>
+          </w:p>
+          <w:p>
+            <w:pPr>
+              <w:spacing w:after="0" w:before="0" w:line="240" w:lineRule="auto"/>
+            </w:pPr>
+            <w:r>
+              <w:rPr>
+                <w:rFonts w:ascii="Consolas" w:hAnsi="Consolas" w:eastAsia="Consolas"/>
+                <w:b w:val="0"/>
+                <w:i w:val="0"/>
+                <w:sz w:val="16"/>
+              </w:rPr>
+              <w:t xml:space="preserve"> 277              if go:</w:t>
+            </w:r>
+          </w:p>
+          <w:p>
+            <w:pPr>
+              <w:spacing w:after="0" w:before="0" w:line="240" w:lineRule="auto"/>
+            </w:pPr>
+            <w:r>
+              <w:rPr>
+                <w:rFonts w:ascii="Consolas" w:hAnsi="Consolas" w:eastAsia="Consolas"/>
+                <w:b w:val="0"/>
+                <w:i w:val="0"/>
+                <w:sz w:val="16"/>
+              </w:rPr>
+              <w:t xml:space="preserve"> 278                  self._release()</w:t>
+            </w:r>
+          </w:p>
+          <w:p>
+            <w:pPr>
+              <w:spacing w:after="0" w:before="0" w:line="240" w:lineRule="auto"/>
+            </w:pPr>
+            <w:r>
+              <w:rPr>
+                <w:rFonts w:ascii="Consolas" w:hAnsi="Consolas" w:eastAsia="Consolas"/>
+                <w:b w:val="0"/>
+                <w:i w:val="0"/>
+                <w:sz w:val="16"/>
+              </w:rPr>
+              <w:t xml:space="preserve"> 279                  self.set_state("WINCH_UP")</w:t>
+            </w:r>
+          </w:p>
+          <w:p>
+            <w:pPr>
+              <w:spacing w:after="0" w:before="0" w:line="240" w:lineRule="auto"/>
+            </w:pPr>
+            <w:r>
+              <w:rPr>
+                <w:rFonts w:ascii="Consolas" w:hAnsi="Consolas" w:eastAsia="Consolas"/>
+                <w:b w:val="0"/>
+                <w:i w:val="0"/>
+                <w:sz w:val="16"/>
+              </w:rPr>
+              <w:t xml:space="preserve"> 280              elif ts &gt; WINDOW_TIMEOUT:</w:t>
+            </w:r>
+          </w:p>
+          <w:p>
+            <w:pPr>
+              <w:spacing w:after="0" w:before="0" w:line="240" w:lineRule="auto"/>
+            </w:pPr>
+            <w:r>
+              <w:rPr>
+                <w:rFonts w:ascii="Consolas" w:hAnsi="Consolas" w:eastAsia="Consolas"/>
+                <w:b w:val="0"/>
+                <w:i w:val="0"/>
+                <w:sz w:val="16"/>
+              </w:rPr>
+              <w:t xml:space="preserve"> 281                  self.outcome = "aborted_no_steady_window"</w:t>
+            </w:r>
+          </w:p>
+          <w:p>
+            <w:pPr>
+              <w:spacing w:after="0" w:before="0" w:line="240" w:lineRule="auto"/>
+            </w:pPr>
+            <w:r>
+              <w:rPr>
+                <w:rFonts w:ascii="Consolas" w:hAnsi="Consolas" w:eastAsia="Consolas"/>
+                <w:b w:val="0"/>
+                <w:i w:val="0"/>
+                <w:sz w:val="16"/>
+              </w:rPr>
+              <w:t xml:space="preserve"> 282                  self.set_state("ABORT")</w:t>
+            </w:r>
+          </w:p>
+          <w:p>
+            <w:pPr>
+              <w:spacing w:after="0" w:before="0" w:line="240" w:lineRule="auto"/>
+            </w:pPr>
+            <w:r>
+              <w:rPr>
+                <w:rFonts w:ascii="Consolas" w:hAnsi="Consolas" w:eastAsia="Consolas"/>
+                <w:b w:val="0"/>
+                <w:i w:val="0"/>
+                <w:sz w:val="16"/>
+              </w:rPr>
+              <w:t xml:space="preserve"> 283          elif s in ("WINCH_UP", "ABORT"):</w:t>
+            </w:r>
+          </w:p>
+          <w:p>
+            <w:pPr>
+              <w:spacing w:after="0" w:before="0" w:line="240" w:lineRule="auto"/>
+            </w:pPr>
+            <w:r>
+              <w:rPr>
+                <w:rFonts w:ascii="Consolas" w:hAnsi="Consolas" w:eastAsia="Consolas"/>
+                <w:b w:val="0"/>
+                <w:i w:val="0"/>
+                <w:sz w:val="16"/>
+              </w:rPr>
+              <w:t xml:space="preserve"> 284              if self.d.qpos[self.q_winch] &lt;= -3.2 or ts &gt; 12.0:</w:t>
+            </w:r>
+          </w:p>
+          <w:p>
+            <w:pPr>
+              <w:spacing w:after="0" w:before="0" w:line="240" w:lineRule="auto"/>
+            </w:pPr>
+            <w:r>
+              <w:rPr>
+                <w:rFonts w:ascii="Consolas" w:hAnsi="Consolas" w:eastAsia="Consolas"/>
+                <w:b w:val="0"/>
+                <w:i w:val="0"/>
+                <w:sz w:val="16"/>
+              </w:rPr>
+              <w:t xml:space="preserve"> 285                  self.set_state("RETURN_TO_BASE")</w:t>
+            </w:r>
+          </w:p>
+          <w:p>
+            <w:pPr>
+              <w:spacing w:after="0" w:before="0" w:line="240" w:lineRule="auto"/>
+            </w:pPr>
+            <w:r>
+              <w:rPr>
+                <w:rFonts w:ascii="Consolas" w:hAnsi="Consolas" w:eastAsia="Consolas"/>
+                <w:b w:val="0"/>
+                <w:i w:val="0"/>
+                <w:sz w:val="16"/>
+              </w:rPr>
+              <w:t xml:space="preserve"> 286                  self._new_segment(p, np.array([PAD[0], PAD[1], Z_CRUISE]), V_CRUISE)</w:t>
             </w:r>
           </w:p>
         </w:tc>
@@ -4509,29 +4857,153 @@
       </w:tblGrid>
       <w:tr>
         <w:trPr>
-          <w:trHeight w:val="2381" w:hRule="exact"/>
           <w:cantSplit/>
         </w:trPr>
         <w:tc>
           <w:tcPr>
             <w:tcW w:type="dxa" w:w="10205"/>
+            <w:vAlign w:val="top"/>
           </w:tcPr>
           <w:p>
             <w:pPr>
               <w:spacing w:after="0"/>
               <w:jc w:val="center"/>
             </w:pPr>
-            <w:r/>
             <w:r>
               <w:rPr>
-                <w:b w:val="0"/>
-                <w:i/>
-                <w:color w:val="595959"/>
-                <w:sz w:val="15"/>
+                <w:b/>
+                <w:i w:val="0"/>
+                <w:sz w:val="14"/>
               </w:rPr>
-              <w:t>[ FBD (phone photo of a hand sketch is fine) → symbols explained → worked example → where this value appears in your telemetry CSV ]</w:t>
+              <w:t>Free-body diagram (hover in crosswind, docs/figures/fig_fbd.png) and worked example</w:t>
             </w:r>
           </w:p>
+          <w:tbl>
+            <w:tblPr>
+              <w:tblW w:type="auto" w:w="0"/>
+              <w:tblLook w:firstColumn="1" w:firstRow="1" w:lastColumn="0" w:lastRow="0" w:noHBand="0" w:noVBand="1" w:val="04A0"/>
+            </w:tblPr>
+            <w:tblGrid>
+              <w:gridCol w:w="3402"/>
+              <w:gridCol w:w="6236"/>
+            </w:tblGrid>
+            <w:tr>
+              <w:tc>
+                <w:tcPr>
+                  <w:tcW w:type="dxa" w:w="3402"/>
+                  <w:vAlign w:val="top"/>
+                </w:tcPr>
+                <w:p>
+                  <w:pPr>
+                    <w:spacing w:before="0"/>
+                  </w:pPr>
+                  <w:r>
+                    <w:drawing>
+                      <wp:inline xmlns:a="http://schemas.openxmlformats.org/drawingml/2006/main" xmlns:pic="http://schemas.openxmlformats.org/drawingml/2006/picture">
+                        <wp:extent cx="2015999" cy="1903999"/>
+                        <wp:docPr id="1" name="Picture 1"/>
+                        <wp:cNvGraphicFramePr>
+                          <a:graphicFrameLocks noChangeAspect="1"/>
+                        </wp:cNvGraphicFramePr>
+                        <a:graphic>
+                          <a:graphicData uri="http://schemas.openxmlformats.org/drawingml/2006/picture">
+                            <pic:pic>
+                              <pic:nvPicPr>
+                                <pic:cNvPr id="0" name="fig_fbd.png"/>
+                                <pic:cNvPicPr/>
+                              </pic:nvPicPr>
+                              <pic:blipFill>
+                                <a:blip r:embed="rId10"/>
+                                <a:stretch>
+                                  <a:fillRect/>
+                                </a:stretch>
+                              </pic:blipFill>
+                              <pic:spPr>
+                                <a:xfrm>
+                                  <a:off x="0" y="0"/>
+                                  <a:ext cx="2015999" cy="1903999"/>
+                                </a:xfrm>
+                                <a:prstGeom prst="rect"/>
+                              </pic:spPr>
+                            </pic:pic>
+                          </a:graphicData>
+                        </a:graphic>
+                      </wp:inline>
+                    </w:drawing>
+                  </w:r>
+                </w:p>
+              </w:tc>
+              <w:tc>
+                <w:tcPr>
+                  <w:tcW w:type="dxa" w:w="6236"/>
+                  <w:vAlign w:val="top"/>
+                </w:tcPr>
+                <w:p>
+                  <w:pPr>
+                    <w:spacing w:after="40"/>
+                  </w:pPr>
+                  <w:r>
+                    <w:rPr>
+                      <w:b/>
+                      <w:i w:val="0"/>
+                      <w:sz w:val="14"/>
+                    </w:rPr>
+                    <w:t xml:space="preserve">Symbols: </w:t>
+                  </w:r>
+                  <w:r>
+                    <w:rPr>
+                      <w:b w:val="0"/>
+                      <w:i w:val="0"/>
+                      <w:sz w:val="14"/>
+                    </w:rPr>
+                    <w:t>T₁…T₄ rotor thrusts (N, ≤ 35 N each); m_u = 3.355 kg airframe + cable + hook; m_p canister mass (kg); F_d = ½ρC_dA v² quadratic drag, ρ = 1.225 kg/m³, C_dA = 0.10 m² (UAV) and 0.08 m² (canister: 0.28 × 0.36 m, C_d 0.8); θ cable swing angle; T_c cable tension; φ airframe tilt.</w:t>
+                  </w:r>
+                </w:p>
+                <w:p>
+                  <w:pPr>
+                    <w:spacing w:after="40"/>
+                  </w:pPr>
+                  <w:r>
+                    <w:rPr>
+                      <w:b/>
+                      <w:i w:val="0"/>
+                      <w:sz w:val="14"/>
+                    </w:rPr>
+                    <w:t xml:space="preserve">Worked example </w:t>
+                  </w:r>
+                  <w:r>
+                    <w:rPr>
+                      <w:b w:val="0"/>
+                      <w:i w:val="0"/>
+                      <w:sz w:val="14"/>
+                    </w:rPr>
+                    <w:t>(hover, U = 10 m/s, m_p = 2 kg): F_d,p = ½·1.225·0.08·10² = 4.90 N; tan θ = F_d,p/(m_p g) = 4.90/19.62 = 0.250 → θ = 14.0°. Vertical: ΣT·cos φ = (m_u + m_p) g = 52.5 N → 13.1 N per rotor. Horizontal: F_d,u + F_d,p = 6.13 + 4.90 = 11.03 N → tilt φ = atan(11.03/52.5) = 11.9°.</w:t>
+                  </w:r>
+                </w:p>
+                <w:p>
+                  <w:pPr>
+                    <w:spacing w:after="40"/>
+                  </w:pPr>
+                  <w:r>
+                    <w:rPr>
+                      <w:b/>
+                      <w:i w:val="0"/>
+                      <w:sz w:val="14"/>
+                    </w:rPr>
+                    <w:t xml:space="preserve">In our telemetry: </w:t>
+                  </w:r>
+                  <w:r>
+                    <w:rPr>
+                      <w:b w:val="0"/>
+                      <w:i w:val="0"/>
+                      <w:sz w:val="14"/>
+                    </w:rPr>
+                    <w:t>run 180 (run_180_proposed_w10.csv.gz), m_p = 2.66 kg, HOVER state, 501 samples at 500 Hz: swing_deg = 9.7 ± 1.2° vs 9.8° predicted for the mean wind 9.6 m/s (gusts make it swing about that value); mean T1_N…T4_N = 16.1 N per rotor vs 14.7 N static prediction.</w:t>
+                  </w:r>
+                </w:p>
+              </w:tc>
+            </w:tr>
+          </w:tbl>
         </w:tc>
       </w:tr>
     </w:tbl>
@@ -5000,7 +5472,7 @@
                     <w:sz w:val="14"/>
                     <w:szCs w:val="14"/>
                   </w:rPr>
-                  <w:t xml:space="preserve">type here</w:t>
+                  <w:t xml:space="preserve">λ = 2 requests/h × 12 h/day [assumption]; boat round trip 105 min [assumption: 5 km, 8 km/h, 30 min launch]; crew 4 [assumption]</w:t>
                 </w:r>
               </w:sdtContent>
             </w:sdt>
@@ -5032,7 +5504,7 @@
                     <w:sz w:val="14"/>
                     <w:szCs w:val="14"/>
                   </w:rPr>
-                  <w:t xml:space="preserve">type here</w:t>
+                  <w:t xml:space="preserve">168 boat-crew hours/day (24 urgent deliveries/day moved to UAVs)</w:t>
                 </w:r>
               </w:sdtContent>
             </w:sdt>
@@ -5112,7 +5584,7 @@
                     <w:sz w:val="14"/>
                     <w:szCs w:val="14"/>
                   </w:rPr>
-                  <w:t xml:space="preserve">type here</w:t>
+                  <w:t xml:space="preserve">CapEx = 300 boat-h per UAV × 2 [assumption]; ΔOpEx from κ below × 24/day × 60 flood days/yr [assumption]; T_life 3 yr [assumption]</w:t>
                 </w:r>
               </w:sdtContent>
             </w:sdt>
@@ -5144,7 +5616,7 @@
                     <w:sz w:val="14"/>
                     <w:szCs w:val="14"/>
                   </w:rPr>
-                  <w:t xml:space="preserve">type here</w:t>
+                  <w:t xml:space="preserve">P_payback = 0.082 (–); T_payback = 3.0 months</w:t>
                 </w:r>
               </w:sdtContent>
             </w:sdt>
@@ -5224,7 +5696,7 @@
                     <w:sz w:val="14"/>
                     <w:szCs w:val="14"/>
                   </w:rPr>
-                  <w:t xml:space="preserve">type here</w:t>
+                  <w:t xml:space="preserve">C_boat = round trip × 1 boat-h; C_uav = (1/p_success) × flight time × r_uav; p_success 0.833 and drop-site time 10 s [SIM]; r_uav 0.15 [assumption]</w:t>
                 </w:r>
               </w:sdtContent>
             </w:sdt>
@@ -5256,7 +5728,7 @@
                     <w:sz w:val="14"/>
                     <w:szCs w:val="14"/>
                   </w:rPr>
-                  <w:t xml:space="preserve">type here</w:t>
+                  <w:t xml:space="preserve">κ = 0.036; NCRI = 0.964 (–)</w:t>
                 </w:r>
               </w:sdtContent>
             </w:sdt>
@@ -5336,7 +5808,7 @@
                     <w:sz w:val="14"/>
                     <w:szCs w:val="14"/>
                   </w:rPr>
-                  <w:t xml:space="preserve">type here</w:t>
+                  <w:t xml:space="preserve">λ = 2/h [assumption]; μ_UAV = 1.61/h from cycle 31 min incl. re-flights [SIM+assumption]; c = 2 UAVs vs 4 boats (μ = 0.57/h)</w:t>
                 </w:r>
               </w:sdtContent>
             </w:sdt>
@@ -5368,7 +5840,7 @@
                     <w:sz w:val="14"/>
                     <w:szCs w:val="14"/>
                   </w:rPr>
-                  <w:t xml:space="preserve">type here</w:t>
+                  <w:t xml:space="preserve">UAV ρ = 0.62, W_q = 23.2 min; boats ρ = 0.88, W_q = 155 min</w:t>
                 </w:r>
               </w:sdtContent>
             </w:sdt>
@@ -5445,7 +5917,7 @@
                     <w:sz w:val="14"/>
                     <w:szCs w:val="14"/>
                   </w:rPr>
-                  <w:t xml:space="preserve">type here</w:t>
+                  <w:t xml:space="preserve">All assumptions ±30 % (tornado); UAV CapEx = most uncertain input (no verified price data), swept 0.4× to 15× in the graph</w:t>
                 </w:r>
               </w:sdtContent>
             </w:sdt>
@@ -5476,7 +5948,7 @@
                     <w:sz w:val="14"/>
                     <w:szCs w:val="14"/>
                   </w:rPr>
-                  <w:t xml:space="preserve">type here</w:t>
+                  <w:t xml:space="preserve">Most influential (tornado): λ, break-even P = 1 at λ = 0.16 requests/h; CapEx break-even P = 1 at 3,644 boat-h/UAV (12× assumed); NCRI = 0 at r_uav = 4.2</w:t>
                 </w:r>
               </w:sdtContent>
             </w:sdt>
@@ -5558,7 +6030,7 @@
                     <w:sz w:val="15"/>
                     <w:szCs w:val="15"/>
                   </w:rPr>
-                  <w:t xml:space="preserve">Select ▾</w:t>
+                  <w:t xml:space="preserve">M/M/c</w:t>
                 </w:r>
               </w:sdtContent>
             </w:sdt>
@@ -5617,7 +6089,7 @@
                     <w:sz w:val="15"/>
                     <w:szCs w:val="15"/>
                   </w:rPr>
-                  <w:t xml:space="preserve">type here</w:t>
+                  <w:t xml:space="preserve">λ = 2 requests/h; μ = 1.61 sorties/h per UAV; c = 2 UAVs (boats: μ = 0.57/h, c = 4)</w:t>
                 </w:r>
               </w:sdtContent>
             </w:sdt>
@@ -5676,7 +6148,7 @@
                     <w:sz w:val="15"/>
                     <w:szCs w:val="15"/>
                   </w:rPr>
-                  <w:t xml:space="preserve">type here</w:t>
+                  <w:t xml:space="preserve">3.0 months (calendar; savings accrue only in the 60 flood days/yr)</w:t>
                 </w:r>
               </w:sdtContent>
             </w:sdt>
@@ -5737,7 +6209,7 @@
                     <w:sz w:val="15"/>
                     <w:szCs w:val="15"/>
                   </w:rPr>
-                  <w:t xml:space="preserve">Select ▾</w:t>
+                  <w:t xml:space="preserve">Yes</w:t>
                 </w:r>
               </w:sdtContent>
             </w:sdt>
@@ -6054,7 +6526,7 @@
                     <w:sz w:val="14"/>
                     <w:szCs w:val="14"/>
                   </w:rPr>
-                  <w:t xml:space="preserve">type here</w:t>
+                  <w:t xml:space="preserve">kit lands in water / wrong roof; re-fly, medicine lost</w:t>
                 </w:r>
               </w:sdtContent>
             </w:sdt>
@@ -6098,7 +6570,7 @@
                     <w:sz w:val="14"/>
                     <w:szCs w:val="14"/>
                   </w:rPr>
-                  <w:t xml:space="preserve">Select ▾</w:t>
+                  <w:t xml:space="preserve">8</w:t>
                 </w:r>
               </w:sdtContent>
             </w:sdt>
@@ -6142,7 +6614,7 @@
                     <w:sz w:val="14"/>
                     <w:szCs w:val="14"/>
                   </w:rPr>
-                  <w:t xml:space="preserve">Select ▾</w:t>
+                  <w:t xml:space="preserve">7</w:t>
                 </w:r>
               </w:sdtContent>
             </w:sdt>
@@ -6186,7 +6658,7 @@
                     <w:sz w:val="14"/>
                     <w:szCs w:val="14"/>
                   </w:rPr>
-                  <w:t xml:space="preserve">Select ▾</w:t>
+                  <w:t xml:space="preserve">5</w:t>
                 </w:r>
               </w:sdtContent>
             </w:sdt>
@@ -6218,7 +6690,7 @@
                     <w:sz w:val="14"/>
                     <w:szCs w:val="14"/>
                   </w:rPr>
-                  <w:t xml:space="preserve">type here</w:t>
+                  <w:t xml:space="preserve">280</w:t>
                 </w:r>
               </w:sdtContent>
             </w:sdt>
@@ -6250,7 +6722,7 @@
                     <w:sz w:val="14"/>
                     <w:szCs w:val="14"/>
                   </w:rPr>
-                  <w:t xml:space="preserve">type here</w:t>
+                  <w:t xml:space="preserve">vision canister centring + anti-sway + steady release window; ABORT instead of a blind drop</w:t>
                 </w:r>
               </w:sdtContent>
             </w:sdt>
@@ -6282,7 +6754,7 @@
                     <w:sz w:val="14"/>
                     <w:szCs w:val="14"/>
                   </w:rPr>
-                  <w:t xml:space="preserve">type here</w:t>
+                  <w:t xml:space="preserve">48</w:t>
                 </w:r>
               </w:sdtContent>
             </w:sdt>
@@ -6320,7 +6792,7 @@
                     <w:sz w:val="14"/>
                     <w:szCs w:val="14"/>
                   </w:rPr>
-                  <w:t xml:space="preserve">Select ▾</w:t>
+                  <w:t xml:space="preserve">Both</w:t>
                 </w:r>
               </w:sdtContent>
             </w:sdt>
@@ -6379,7 +6851,7 @@
                     <w:sz w:val="14"/>
                     <w:szCs w:val="14"/>
                   </w:rPr>
-                  <w:t xml:space="preserve">type here</w:t>
+                  <w:t xml:space="preserve">UAV ditched in flood water; fleet capacity lost</w:t>
                 </w:r>
               </w:sdtContent>
             </w:sdt>
@@ -6423,7 +6895,7 @@
                     <w:sz w:val="14"/>
                     <w:szCs w:val="14"/>
                   </w:rPr>
-                  <w:t xml:space="preserve">Select ▾</w:t>
+                  <w:t xml:space="preserve">9</w:t>
                 </w:r>
               </w:sdtContent>
             </w:sdt>
@@ -6467,7 +6939,7 @@
                     <w:sz w:val="14"/>
                     <w:szCs w:val="14"/>
                   </w:rPr>
-                  <w:t xml:space="preserve">Select ▾</w:t>
+                  <w:t xml:space="preserve">3</w:t>
                 </w:r>
               </w:sdtContent>
             </w:sdt>
@@ -6511,7 +6983,7 @@
                     <w:sz w:val="14"/>
                     <w:szCs w:val="14"/>
                   </w:rPr>
-                  <w:t xml:space="preserve">Select ▾</w:t>
+                  <w:t xml:space="preserve">6</w:t>
                 </w:r>
               </w:sdtContent>
             </w:sdt>
@@ -6543,7 +7015,7 @@
                     <w:sz w:val="14"/>
                     <w:szCs w:val="14"/>
                   </w:rPr>
-                  <w:t xml:space="preserve">type here</w:t>
+                  <w:t xml:space="preserve">162</w:t>
                 </w:r>
               </w:sdtContent>
             </w:sdt>
@@ -6575,7 +7047,7 @@
                     <w:sz w:val="14"/>
                     <w:szCs w:val="14"/>
                   </w:rPr>
-                  <w:t xml:space="preserve">type here</w:t>
+                  <w:t xml:space="preserve">power model in the loop; ABORT/RTB if predicted SoC at the pad &lt; 25 % (--battery-soc 0.3 demo)</w:t>
                 </w:r>
               </w:sdtContent>
             </w:sdt>
@@ -6607,7 +7079,7 @@
                     <w:sz w:val="14"/>
                     <w:szCs w:val="14"/>
                   </w:rPr>
-                  <w:t xml:space="preserve">type here</w:t>
+                  <w:t xml:space="preserve">36</w:t>
                 </w:r>
               </w:sdtContent>
             </w:sdt>
@@ -6645,7 +7117,7 @@
                     <w:sz w:val="14"/>
                     <w:szCs w:val="14"/>
                   </w:rPr>
-                  <w:t xml:space="preserve">Select ▾</w:t>
+                  <w:t xml:space="preserve">Code</w:t>
                 </w:r>
               </w:sdtContent>
             </w:sdt>
@@ -6683,7 +7155,7 @@
                     <w:sz w:val="14"/>
                     <w:szCs w:val="14"/>
                   </w:rPr>
-                  <w:t xml:space="preserve">type here</w:t>
+                  <w:t xml:space="preserve">Canister released while still swinging (timed release)</w:t>
                 </w:r>
               </w:sdtContent>
             </w:sdt>
@@ -6715,7 +7187,7 @@
                     <w:sz w:val="14"/>
                     <w:szCs w:val="14"/>
                   </w:rPr>
-                  <w:t xml:space="preserve">type here</w:t>
+                  <w:t xml:space="preserve">drop error grows with swing; kit damaged</w:t>
                 </w:r>
               </w:sdtContent>
             </w:sdt>
@@ -6759,7 +7231,7 @@
                     <w:sz w:val="14"/>
                     <w:szCs w:val="14"/>
                   </w:rPr>
-                  <w:t xml:space="preserve">Select ▾</w:t>
+                  <w:t xml:space="preserve">7</w:t>
                 </w:r>
               </w:sdtContent>
             </w:sdt>
@@ -6803,7 +7275,7 @@
                     <w:sz w:val="14"/>
                     <w:szCs w:val="14"/>
                   </w:rPr>
-                  <w:t xml:space="preserve">Select ▾</w:t>
+                  <w:t xml:space="preserve">6</w:t>
                 </w:r>
               </w:sdtContent>
             </w:sdt>
@@ -6847,7 +7319,7 @@
                     <w:sz w:val="14"/>
                     <w:szCs w:val="14"/>
                   </w:rPr>
-                  <w:t xml:space="preserve">Select ▾</w:t>
+                  <w:t xml:space="preserve">6</w:t>
                 </w:r>
               </w:sdtContent>
             </w:sdt>
@@ -6879,7 +7351,7 @@
                     <w:sz w:val="14"/>
                     <w:szCs w:val="14"/>
                   </w:rPr>
-                  <w:t xml:space="preserve">type here</w:t>
+                  <w:t xml:space="preserve">252</w:t>
                 </w:r>
               </w:sdtContent>
             </w:sdt>
@@ -6911,7 +7383,7 @@
                     <w:sz w:val="14"/>
                     <w:szCs w:val="14"/>
                   </w:rPr>
-                  <w:t xml:space="preserve">type here</w:t>
+                  <w:t xml:space="preserve">release only if canister error &lt; 0.35 m and rel. speed &lt; 0.35 m/s, else wait / abort</w:t>
                 </w:r>
               </w:sdtContent>
             </w:sdt>
@@ -6943,7 +7415,7 @@
                     <w:sz w:val="14"/>
                     <w:szCs w:val="14"/>
                   </w:rPr>
-                  <w:t xml:space="preserve">type here</w:t>
+                  <w:t xml:space="preserve">28</w:t>
                 </w:r>
               </w:sdtContent>
             </w:sdt>
@@ -6981,7 +7453,7 @@
                     <w:sz w:val="14"/>
                     <w:szCs w:val="14"/>
                   </w:rPr>
-                  <w:t xml:space="preserve">Select ▾</w:t>
+                  <w:t xml:space="preserve">Both</w:t>
                 </w:r>
               </w:sdtContent>
             </w:sdt>
@@ -7019,7 +7491,7 @@
                     <w:sz w:val="14"/>
                     <w:szCs w:val="14"/>
                   </w:rPr>
-                  <w:t xml:space="preserve">type here</w:t>
+                  <w:t xml:space="preserve">Vision noise / glare on the drop marker</w:t>
                 </w:r>
               </w:sdtContent>
             </w:sdt>
@@ -7051,7 +7523,7 @@
                     <w:sz w:val="14"/>
                     <w:szCs w:val="14"/>
                   </w:rPr>
-                  <w:t xml:space="preserve">type here</w:t>
+                  <w:t xml:space="preserve">wrong centring → off-zone drop</w:t>
                 </w:r>
               </w:sdtContent>
             </w:sdt>
@@ -7095,7 +7567,7 @@
                     <w:sz w:val="14"/>
                     <w:szCs w:val="14"/>
                   </w:rPr>
-                  <w:t xml:space="preserve">Select ▾</w:t>
+                  <w:t xml:space="preserve">6</w:t>
                 </w:r>
               </w:sdtContent>
             </w:sdt>
@@ -7139,7 +7611,7 @@
                     <w:sz w:val="14"/>
                     <w:szCs w:val="14"/>
                   </w:rPr>
-                  <w:t xml:space="preserve">Select ▾</w:t>
+                  <w:t xml:space="preserve">4</w:t>
                 </w:r>
               </w:sdtContent>
             </w:sdt>
@@ -7183,7 +7655,7 @@
                     <w:sz w:val="14"/>
                     <w:szCs w:val="14"/>
                   </w:rPr>
-                  <w:t xml:space="preserve">Select ▾</w:t>
+                  <w:t xml:space="preserve">6</w:t>
                 </w:r>
               </w:sdtContent>
             </w:sdt>
@@ -7215,7 +7687,7 @@
                     <w:sz w:val="14"/>
                     <w:szCs w:val="14"/>
                   </w:rPr>
-                  <w:t xml:space="preserve">type here</w:t>
+                  <w:t xml:space="preserve">144</w:t>
                 </w:r>
               </w:sdtContent>
             </w:sdt>
@@ -7247,7 +7719,7 @@
                     <w:sz w:val="14"/>
                     <w:szCs w:val="14"/>
                   </w:rPr>
-                  <w:t xml:space="preserve">type here</w:t>
+                  <w:t xml:space="preserve">α-β filter on 30 Hz camera data; 5 cm noise in every trial</w:t>
                 </w:r>
               </w:sdtContent>
             </w:sdt>
@@ -7279,7 +7751,7 @@
                     <w:sz w:val="14"/>
                     <w:szCs w:val="14"/>
                   </w:rPr>
-                  <w:t xml:space="preserve">type here</w:t>
+                  <w:t xml:space="preserve">54</w:t>
                 </w:r>
               </w:sdtContent>
             </w:sdt>
@@ -7317,7 +7789,7 @@
                     <w:sz w:val="14"/>
                     <w:szCs w:val="14"/>
                   </w:rPr>
-                  <w:t xml:space="preserve">Select ▾</w:t>
+                  <w:t xml:space="preserve">Simulation</w:t>
                 </w:r>
               </w:sdtContent>
             </w:sdt>
@@ -7354,7 +7826,7 @@
                     <w:sz w:val="14"/>
                     <w:szCs w:val="14"/>
                   </w:rPr>
-                  <w:t xml:space="preserve">type here</w:t>
+                  <w:t xml:space="preserve">Rotor thrust saturation in gusts</w:t>
                 </w:r>
               </w:sdtContent>
             </w:sdt>
@@ -7385,7 +7857,7 @@
                     <w:sz w:val="14"/>
                     <w:szCs w:val="14"/>
                   </w:rPr>
-                  <w:t xml:space="preserve">type here</w:t>
+                  <w:t xml:space="preserve">position loss near buildings, possible crash</w:t>
                 </w:r>
               </w:sdtContent>
             </w:sdt>
@@ -7428,7 +7900,7 @@
                     <w:sz w:val="14"/>
                     <w:szCs w:val="14"/>
                   </w:rPr>
-                  <w:t xml:space="preserve">Select ▾</w:t>
+                  <w:t xml:space="preserve">9</w:t>
                 </w:r>
               </w:sdtContent>
             </w:sdt>
@@ -7471,7 +7943,7 @@
                     <w:sz w:val="14"/>
                     <w:szCs w:val="14"/>
                   </w:rPr>
-                  <w:t xml:space="preserve">Select ▾</w:t>
+                  <w:t xml:space="preserve">3</w:t>
                 </w:r>
               </w:sdtContent>
             </w:sdt>
@@ -7514,7 +7986,7 @@
                     <w:sz w:val="14"/>
                     <w:szCs w:val="14"/>
                   </w:rPr>
-                  <w:t xml:space="preserve">Select ▾</w:t>
+                  <w:t xml:space="preserve">5</w:t>
                 </w:r>
               </w:sdtContent>
             </w:sdt>
@@ -7545,7 +8017,7 @@
                     <w:sz w:val="14"/>
                     <w:szCs w:val="14"/>
                   </w:rPr>
-                  <w:t xml:space="preserve">type here</w:t>
+                  <w:t xml:space="preserve">135</w:t>
                 </w:r>
               </w:sdtContent>
             </w:sdt>
@@ -7576,7 +8048,7 @@
                     <w:sz w:val="14"/>
                     <w:szCs w:val="14"/>
                   </w:rPr>
-                  <w:t xml:space="preserve">type here</w:t>
+                  <w:t xml:space="preserve">35° tilt limit, T/W ≥ 2.2 at 3 kg, integral wind rejection; crash check every run</w:t>
                 </w:r>
               </w:sdtContent>
             </w:sdt>
@@ -7607,7 +8079,7 @@
                     <w:sz w:val="14"/>
                     <w:szCs w:val="14"/>
                   </w:rPr>
-                  <w:t xml:space="preserve">type here</w:t>
+                  <w:t xml:space="preserve">54</w:t>
                 </w:r>
               </w:sdtContent>
             </w:sdt>
@@ -7644,7 +8116,7 @@
                     <w:sz w:val="14"/>
                     <w:szCs w:val="14"/>
                   </w:rPr>
-                  <w:t xml:space="preserve">Select ▾</w:t>
+                  <w:t xml:space="preserve">Both</w:t>
                 </w:r>
               </w:sdtContent>
             </w:sdt>
@@ -7671,7 +8143,7 @@
       </w:tblGrid>
       <w:tr>
         <w:trPr>
-          <w:trHeight w:val="2608" w:hRule="exact"/>
+          <w:trHeight w:val="2608" w:hRule="atLeast"/>
           <w:cantSplit/>
         </w:trPr>
         <w:tc>
@@ -7684,15 +8156,49 @@
               <w:spacing w:after="0"/>
               <w:jc w:val="center"/>
             </w:pPr>
-            <w:r/>
+            <w:r>
+              <w:drawing>
+                <wp:inline xmlns:a="http://schemas.openxmlformats.org/drawingml/2006/main" xmlns:pic="http://schemas.openxmlformats.org/drawingml/2006/picture">
+                  <wp:extent cx="3096000" cy="2342919"/>
+                  <wp:docPr id="2" name="Picture 2"/>
+                  <wp:cNvGraphicFramePr>
+                    <a:graphicFrameLocks noChangeAspect="1"/>
+                  </wp:cNvGraphicFramePr>
+                  <a:graphic>
+                    <a:graphicData uri="http://schemas.openxmlformats.org/drawingml/2006/picture">
+                      <pic:pic>
+                        <pic:nvPicPr>
+                          <pic:cNvPr id="0" name="fig_business_sensitivity.png"/>
+                          <pic:cNvPicPr/>
+                        </pic:nvPicPr>
+                        <pic:blipFill>
+                          <a:blip r:embed="rId11"/>
+                          <a:stretch>
+                            <a:fillRect/>
+                          </a:stretch>
+                        </pic:blipFill>
+                        <pic:spPr>
+                          <a:xfrm>
+                            <a:off x="0" y="0"/>
+                            <a:ext cx="3096000" cy="2342919"/>
+                          </a:xfrm>
+                          <a:prstGeom prst="rect"/>
+                        </pic:spPr>
+                      </pic:pic>
+                    </a:graphicData>
+                  </a:graphic>
+                </wp:inline>
+              </w:drawing>
+            </w:r>
+          </w:p>
+          <w:p>
             <w:r>
               <w:rPr>
                 <w:b w:val="0"/>
                 <w:i/>
-                <w:color w:val="595959"/>
-                <w:sz w:val="15"/>
+                <w:sz w:val="13"/>
               </w:rPr>
-              <w:t>[ Sensitivity graph: P_payback / NCRI vs the uncertain input ]</w:t>
+              <w:t>P_payback and NCRI vs UAV CapEx (most uncertain input), break-even marked</w:t>
             </w:r>
           </w:p>
         </w:tc>
@@ -7706,15 +8212,49 @@
               <w:spacing w:after="0"/>
               <w:jc w:val="center"/>
             </w:pPr>
-            <w:r/>
+            <w:r>
+              <w:drawing>
+                <wp:inline xmlns:a="http://schemas.openxmlformats.org/drawingml/2006/main" xmlns:pic="http://schemas.openxmlformats.org/drawingml/2006/picture">
+                  <wp:extent cx="3096000" cy="2342919"/>
+                  <wp:docPr id="3" name="Picture 3"/>
+                  <wp:cNvGraphicFramePr>
+                    <a:graphicFrameLocks noChangeAspect="1"/>
+                  </wp:cNvGraphicFramePr>
+                  <a:graphic>
+                    <a:graphicData uri="http://schemas.openxmlformats.org/drawingml/2006/picture">
+                      <pic:pic>
+                        <pic:nvPicPr>
+                          <pic:cNvPr id="0" name="fig_business_queue.png"/>
+                          <pic:cNvPicPr/>
+                        </pic:nvPicPr>
+                        <pic:blipFill>
+                          <a:blip r:embed="rId12"/>
+                          <a:stretch>
+                            <a:fillRect/>
+                          </a:stretch>
+                        </pic:blipFill>
+                        <pic:spPr>
+                          <a:xfrm>
+                            <a:off x="0" y="0"/>
+                            <a:ext cx="3096000" cy="2342919"/>
+                          </a:xfrm>
+                          <a:prstGeom prst="rect"/>
+                        </pic:spPr>
+                      </pic:pic>
+                    </a:graphicData>
+                  </a:graphic>
+                </wp:inline>
+              </w:drawing>
+            </w:r>
+          </w:p>
+          <w:p>
             <w:r>
               <w:rPr>
                 <w:b w:val="0"/>
                 <w:i/>
-                <w:color w:val="595959"/>
-                <w:sz w:val="15"/>
+                <w:sz w:val="13"/>
               </w:rPr>
-              <w:t>[ Queuing graph: W_q vs utilisation ρ, or labour-reallocation chart ]</w:t>
+              <w:t>M/M/c waiting time vs utilisation, our operating point</w:t>
             </w:r>
           </w:p>
         </w:tc>
@@ -8168,7 +8708,7 @@
                     <w:sz w:val="15"/>
                     <w:szCs w:val="15"/>
                   </w:rPr>
-                  <w:t xml:space="preserve">type here</w:t>
+                  <w:t xml:space="preserve">'GPS waypoint drop': same airframe and cascaded PD loop on the DRONE position, no canister sensing, no integral, canister released as soon as the winch is down</w:t>
                 </w:r>
               </w:sdtContent>
             </w:sdt>
@@ -8227,7 +8767,7 @@
                     <w:sz w:val="15"/>
                     <w:szCs w:val="15"/>
                   </w:rPr>
-                  <w:t xml:space="preserve">type here</w:t>
+                  <w:t xml:space="preserve">30 per crosswind × 4 crosswinds = 120 per controller (240 total)</w:t>
                 </w:r>
               </w:sdtContent>
             </w:sdt>
@@ -8286,7 +8826,7 @@
                     <w:sz w:val="15"/>
                     <w:szCs w:val="15"/>
                   </w:rPr>
-                  <w:t xml:space="preserve">type here</w:t>
+                  <w:t xml:space="preserve">Crosswind U ∈ {0, 5, 10, 15} m/s + Gauss–Markov gusts (σ = 0.1U, τ = 2 s); canister mass ~ U(1, 3) kg; launch point ~ U(±2 m); camera noise N(0, 5 cm). Same seed for both controllers.</w:t>
                 </w:r>
               </w:sdtContent>
             </w:sdt>
@@ -8345,7 +8885,7 @@
                     <w:sz w:val="15"/>
                     <w:szCs w:val="15"/>
                   </w:rPr>
-                  <w:t xml:space="preserve">type here</w:t>
+                  <w:t xml:space="preserve">500 Hz (every 0.002 s step; mean 28882 samples/run)</w:t>
                 </w:r>
               </w:sdtContent>
             </w:sdt>
@@ -8408,7 +8948,7 @@
                     <w:sz w:val="15"/>
                     <w:szCs w:val="15"/>
                   </w:rPr>
-                  <w:t xml:space="preserve">Select ▾</w:t>
+                  <w:t xml:space="preserve">Yes</w:t>
                 </w:r>
               </w:sdtContent>
             </w:sdt>
@@ -8465,7 +9005,7 @@
                     <w:sz w:val="15"/>
                     <w:szCs w:val="15"/>
                   </w:rPr>
-                  <w:t xml:space="preserve">type here</w:t>
+                  <w:t xml:space="preserve">Group_08_Manikya_Shourya_Keswani_Vora/analytics/flood_relief_real_trials.csv; 500 Hz logs: analytics/telemetry/*.csv.gz</w:t>
                 </w:r>
               </w:sdtContent>
             </w:sdt>
@@ -8682,7 +9222,7 @@
                     <w:sz w:val="15"/>
                     <w:szCs w:val="15"/>
                   </w:rPr>
-                  <w:t xml:space="preserve">type here</w:t>
+                  <w:t xml:space="preserve">120 / 120</w:t>
                 </w:r>
               </w:sdtContent>
             </w:sdt>
@@ -8714,7 +9254,7 @@
                     <w:sz w:val="15"/>
                     <w:szCs w:val="15"/>
                   </w:rPr>
-                  <w:t xml:space="preserve">type here</w:t>
+                  <w:t xml:space="preserve">0.953 ± 0.419</w:t>
                 </w:r>
               </w:sdtContent>
             </w:sdt>
@@ -8746,7 +9286,7 @@
                     <w:sz w:val="15"/>
                     <w:szCs w:val="15"/>
                   </w:rPr>
-                  <w:t xml:space="preserve">type here</w:t>
+                  <w:t xml:space="preserve">0.700 ± 0.236</w:t>
                 </w:r>
               </w:sdtContent>
             </w:sdt>
@@ -8778,7 +9318,7 @@
                     <w:sz w:val="15"/>
                     <w:szCs w:val="15"/>
                   </w:rPr>
-                  <w:t xml:space="preserve">type here</w:t>
+                  <w:t xml:space="preserve">m</w:t>
                 </w:r>
               </w:sdtContent>
             </w:sdt>
@@ -8814,7 +9354,7 @@
                     <w:sz w:val="14"/>
                     <w:szCs w:val="14"/>
                   </w:rPr>
-                  <w:t xml:space="preserve">Select ▾</w:t>
+                  <w:t xml:space="preserve">Lower is better</w:t>
                 </w:r>
               </w:sdtContent>
             </w:sdt>
@@ -8872,7 +9412,7 @@
                     <w:sz w:val="15"/>
                     <w:szCs w:val="15"/>
                   </w:rPr>
-                  <w:t xml:space="preserve">type here</w:t>
+                  <w:t xml:space="preserve">120 / 120</w:t>
                 </w:r>
               </w:sdtContent>
             </w:sdt>
@@ -8904,7 +9444,7 @@
                     <w:sz w:val="15"/>
                     <w:szCs w:val="15"/>
                   </w:rPr>
-                  <w:t xml:space="preserve">type here</w:t>
+                  <w:t xml:space="preserve">47877 ± 39130</w:t>
                 </w:r>
               </w:sdtContent>
             </w:sdt>
@@ -8936,7 +9476,7 @@
                     <w:sz w:val="15"/>
                     <w:szCs w:val="15"/>
                   </w:rPr>
-                  <w:t xml:space="preserve">type here</w:t>
+                  <w:t xml:space="preserve">32993 ± 11093</w:t>
                 </w:r>
               </w:sdtContent>
             </w:sdt>
@@ -8968,7 +9508,7 @@
                     <w:sz w:val="15"/>
                     <w:szCs w:val="15"/>
                   </w:rPr>
-                  <w:t xml:space="preserve">type here</w:t>
+                  <w:t xml:space="preserve">N²·s (Σ rotor T² dt)</w:t>
                 </w:r>
               </w:sdtContent>
             </w:sdt>
@@ -9004,7 +9544,7 @@
                     <w:sz w:val="14"/>
                     <w:szCs w:val="14"/>
                   </w:rPr>
-                  <w:t xml:space="preserve">Select ▾</w:t>
+                  <w:t xml:space="preserve">Lower is better</w:t>
                 </w:r>
               </w:sdtContent>
             </w:sdt>
@@ -9040,7 +9580,7 @@
                     <w:sz w:val="15"/>
                     <w:szCs w:val="15"/>
                   </w:rPr>
-                  <w:t xml:space="preserve">type here</w:t>
+                  <w:t xml:space="preserve">Radial drop error (released runs)</w:t>
                 </w:r>
               </w:sdtContent>
             </w:sdt>
@@ -9071,7 +9611,7 @@
                     <w:sz w:val="15"/>
                     <w:szCs w:val="15"/>
                   </w:rPr>
-                  <w:t xml:space="preserve">type here</w:t>
+                  <w:t xml:space="preserve">109 / 101</w:t>
                 </w:r>
               </w:sdtContent>
             </w:sdt>
@@ -9102,7 +9642,7 @@
                     <w:sz w:val="15"/>
                     <w:szCs w:val="15"/>
                   </w:rPr>
-                  <w:t xml:space="preserve">type here</w:t>
+                  <w:t xml:space="preserve">2.820 ± 3.553</w:t>
                 </w:r>
               </w:sdtContent>
             </w:sdt>
@@ -9133,7 +9673,7 @@
                     <w:sz w:val="15"/>
                     <w:szCs w:val="15"/>
                   </w:rPr>
-                  <w:t xml:space="preserve">type here</w:t>
+                  <w:t xml:space="preserve">0.306 ± 0.323</w:t>
                 </w:r>
               </w:sdtContent>
             </w:sdt>
@@ -9164,7 +9704,7 @@
                     <w:sz w:val="15"/>
                     <w:szCs w:val="15"/>
                   </w:rPr>
-                  <w:t xml:space="preserve">type here</w:t>
+                  <w:t xml:space="preserve">m</w:t>
                 </w:r>
               </w:sdtContent>
             </w:sdt>
@@ -9199,7 +9739,7 @@
                     <w:sz w:val="14"/>
                     <w:szCs w:val="14"/>
                   </w:rPr>
-                  <w:t xml:space="preserve">Select ▾</w:t>
+                  <w:t xml:space="preserve">Lower is better</w:t>
                 </w:r>
               </w:sdtContent>
             </w:sdt>
@@ -9282,7 +9822,7 @@
                     <w:sz w:val="15"/>
                     <w:szCs w:val="15"/>
                   </w:rPr>
-                  <w:t xml:space="preserve">Select ▾</w:t>
+                  <w:t xml:space="preserve">Welch's t-test</w:t>
                 </w:r>
               </w:sdtContent>
             </w:sdt>
@@ -9341,7 +9881,7 @@
                     <w:sz w:val="15"/>
                     <w:szCs w:val="15"/>
                   </w:rPr>
-                  <w:t xml:space="preserve">type here</w:t>
+                  <w:t xml:space="preserve">t = 7.35, df = 109.9, p = 3.7e-11 (two-sided; Mann–Whitney p = 3.1e-06)</w:t>
                 </w:r>
               </w:sdtContent>
             </w:sdt>
@@ -9400,7 +9940,7 @@
                     <w:sz w:val="15"/>
                     <w:szCs w:val="15"/>
                   </w:rPr>
-                  <w:t xml:space="preserve">type here</w:t>
+                  <w:t xml:space="preserve">d = 0.98</w:t>
                 </w:r>
               </w:sdtContent>
             </w:sdt>
@@ -9457,7 +9997,7 @@
                     <w:sz w:val="15"/>
                     <w:szCs w:val="15"/>
                   </w:rPr>
-                  <w:t xml:space="preserve">type here</w:t>
+                  <w:t xml:space="preserve">[1.837, 3.192] m (baseline − proposed)</w:t>
                 </w:r>
               </w:sdtContent>
             </w:sdt>
@@ -9484,7 +10024,7 @@
       </w:tblGrid>
       <w:tr>
         <w:trPr>
-          <w:trHeight w:val="2608" w:hRule="exact"/>
+          <w:trHeight w:val="2608" w:hRule="atLeast"/>
           <w:cantSplit/>
         </w:trPr>
         <w:tc>
@@ -9497,15 +10037,49 @@
               <w:spacing w:after="0"/>
               <w:jc w:val="center"/>
             </w:pPr>
-            <w:r/>
+            <w:r>
+              <w:drawing>
+                <wp:inline xmlns:a="http://schemas.openxmlformats.org/drawingml/2006/main" xmlns:pic="http://schemas.openxmlformats.org/drawingml/2006/picture">
+                  <wp:extent cx="3096000" cy="3179676"/>
+                  <wp:docPr id="4" name="Picture 4"/>
+                  <wp:cNvGraphicFramePr>
+                    <a:graphicFrameLocks noChangeAspect="1"/>
+                  </wp:cNvGraphicFramePr>
+                  <a:graphic>
+                    <a:graphicData uri="http://schemas.openxmlformats.org/drawingml/2006/picture">
+                      <pic:pic>
+                        <pic:nvPicPr>
+                          <pic:cNvPr id="0" name="fig_trajectory.png"/>
+                          <pic:cNvPicPr/>
+                        </pic:nvPicPr>
+                        <pic:blipFill>
+                          <a:blip r:embed="rId13"/>
+                          <a:stretch>
+                            <a:fillRect/>
+                          </a:stretch>
+                        </pic:blipFill>
+                        <pic:spPr>
+                          <a:xfrm>
+                            <a:off x="0" y="0"/>
+                            <a:ext cx="3096000" cy="3179676"/>
+                          </a:xfrm>
+                          <a:prstGeom prst="rect"/>
+                        </pic:spPr>
+                      </pic:pic>
+                    </a:graphicData>
+                  </a:graphic>
+                </wp:inline>
+              </w:drawing>
+            </w:r>
+          </w:p>
+          <w:p>
             <w:r>
               <w:rPr>
                 <w:b w:val="0"/>
                 <w:i/>
-                <w:color w:val="595959"/>
-                <w:sz w:val="15"/>
+                <w:sz w:val="13"/>
               </w:rPr>
-              <w:t>[ Trajectory plot: reference vs actual, one representative run ]</w:t>
+              <w:t>Representative run (proposed, 10 m/s): reference vs actual, FSM states</w:t>
             </w:r>
           </w:p>
         </w:tc>
@@ -9519,15 +10093,49 @@
               <w:spacing w:after="0"/>
               <w:jc w:val="center"/>
             </w:pPr>
-            <w:r/>
+            <w:r>
+              <w:drawing>
+                <wp:inline xmlns:a="http://schemas.openxmlformats.org/drawingml/2006/main" xmlns:pic="http://schemas.openxmlformats.org/drawingml/2006/picture">
+                  <wp:extent cx="3096000" cy="2342919"/>
+                  <wp:docPr id="5" name="Picture 5"/>
+                  <wp:cNvGraphicFramePr>
+                    <a:graphicFrameLocks noChangeAspect="1"/>
+                  </wp:cNvGraphicFramePr>
+                  <a:graphic>
+                    <a:graphicData uri="http://schemas.openxmlformats.org/drawingml/2006/picture">
+                      <pic:pic>
+                        <pic:nvPicPr>
+                          <pic:cNvPr id="0" name="fig_boxplot.png"/>
+                          <pic:cNvPicPr/>
+                        </pic:nvPicPr>
+                        <pic:blipFill>
+                          <a:blip r:embed="rId14"/>
+                          <a:stretch>
+                            <a:fillRect/>
+                          </a:stretch>
+                        </pic:blipFill>
+                        <pic:spPr>
+                          <a:xfrm>
+                            <a:off x="0" y="0"/>
+                            <a:ext cx="3096000" cy="2342919"/>
+                          </a:xfrm>
+                          <a:prstGeom prst="rect"/>
+                        </pic:spPr>
+                      </pic:pic>
+                    </a:graphicData>
+                  </a:graphic>
+                </wp:inline>
+              </w:drawing>
+            </w:r>
+          </w:p>
+          <w:p>
             <w:r>
               <w:rPr>
                 <w:b w:val="0"/>
                 <w:i/>
-                <w:color w:val="595959"/>
-                <w:sz w:val="15"/>
+                <w:sz w:val="13"/>
               </w:rPr>
-              <w:t>[ Box-plot of the primary metric: baseline vs proposed, N runs each ]</w:t>
+              <w:t>Radial drop error by crosswind, baseline vs proposed (n = 109 / 101)</w:t>
             </w:r>
           </w:p>
         </w:tc>
@@ -9621,7 +10229,7 @@
                     <w:sz w:val="15"/>
                     <w:szCs w:val="15"/>
                   </w:rPr>
-                  <w:t xml:space="preserve">Select ▾</w:t>
+                  <w:t xml:space="preserve">Yes</w:t>
                 </w:r>
               </w:sdtContent>
             </w:sdt>
@@ -9684,7 +10292,7 @@
                     <w:sz w:val="15"/>
                     <w:szCs w:val="15"/>
                   </w:rPr>
-                  <w:t xml:space="preserve">Select ▾</w:t>
+                  <w:t xml:space="preserve">Yes</w:t>
                 </w:r>
               </w:sdtContent>
             </w:sdt>
@@ -9747,7 +10355,7 @@
                     <w:sz w:val="15"/>
                     <w:szCs w:val="15"/>
                   </w:rPr>
-                  <w:t xml:space="preserve">Select ▾</w:t>
+                  <w:t xml:space="preserve">Yes</w:t>
                 </w:r>
               </w:sdtContent>
             </w:sdt>
@@ -9808,7 +10416,7 @@
                     <w:sz w:val="15"/>
                     <w:szCs w:val="15"/>
                   </w:rPr>
-                  <w:t xml:space="preserve">Select ▾</w:t>
+                  <w:t xml:space="preserve">Yes</w:t>
                 </w:r>
               </w:sdtContent>
             </w:sdt>
@@ -10438,7 +11046,7 @@
                     <w:sz w:val="14"/>
                     <w:szCs w:val="14"/>
                   </w:rPr>
-                  <w:t xml:space="preserve">Select ▾</w:t>
+                  <w:t xml:space="preserve">Claude</w:t>
                 </w:r>
               </w:sdtContent>
             </w:sdt>
@@ -10470,7 +11078,7 @@
                     <w:sz w:val="14"/>
                     <w:szCs w:val="14"/>
                   </w:rPr>
-                  <w:t xml:space="preserve">type here</w:t>
+                  <w:t xml:space="preserve">Claude's water-texture baker started one worker process per CPU thread (23) 'to use the whole lab PC'.</w:t>
                 </w:r>
               </w:sdtContent>
             </w:sdt>
@@ -10511,7 +11119,7 @@
                     <w:sz w:val="14"/>
                     <w:szCs w:val="14"/>
                   </w:rPr>
-                  <w:t xml:space="preserve">Select ▾</w:t>
+                  <w:t xml:space="preserve">Ran / tested the code or simulation</w:t>
                 </w:r>
               </w:sdtContent>
             </w:sdt>
@@ -10543,7 +11151,7 @@
                     <w:sz w:val="14"/>
                     <w:szCs w:val="14"/>
                   </w:rPr>
-                  <w:t xml:space="preserve">type here</w:t>
+                  <w:t xml:space="preserve">Setup crashed on the 32 GB lab PC ('OpenBLAS: memory allocation failed', BrokenProcessPool): each worker opened 24 BLAS threads. Fixed: ≤ 8 workers, OPENBLAS_NUM_THREADS = 1 (0.6 GB/worker measured).</w:t>
                 </w:r>
               </w:sdtContent>
             </w:sdt>
@@ -10585,7 +11193,7 @@
                     <w:sz w:val="14"/>
                     <w:szCs w:val="14"/>
                   </w:rPr>
-                  <w:t xml:space="preserve">Select ▾</w:t>
+                  <w:t xml:space="preserve">Wrong code / MuJoCo API</w:t>
                 </w:r>
               </w:sdtContent>
             </w:sdt>
@@ -10622,7 +11230,7 @@
                     <w:sz w:val="14"/>
                     <w:szCs w:val="14"/>
                   </w:rPr>
-                  <w:t xml:space="preserve">Select ▾</w:t>
+                  <w:t xml:space="preserve">Corrected</w:t>
                 </w:r>
               </w:sdtContent>
             </w:sdt>
@@ -10690,7 +11298,7 @@
                     <w:sz w:val="14"/>
                     <w:szCs w:val="14"/>
                   </w:rPr>
-                  <w:t xml:space="preserve">Select ▾</w:t>
+                  <w:t xml:space="preserve">Claude</w:t>
                 </w:r>
               </w:sdtContent>
             </w:sdt>
@@ -10722,7 +11330,7 @@
                     <w:sz w:val="14"/>
                     <w:szCs w:val="14"/>
                   </w:rPr>
-                  <w:t xml:space="preserve">type here</w:t>
+                  <w:t xml:space="preserve">Claude claimed GPU training would speed PPO up and estimated 3.5–6 h for the curriculum, '1 M steps in 10–15 min on 16 cores'.</w:t>
                 </w:r>
               </w:sdtContent>
             </w:sdt>
@@ -10763,7 +11371,7 @@
                     <w:sz w:val="14"/>
                     <w:szCs w:val="14"/>
                   </w:rPr>
-                  <w:t xml:space="preserve">Select ▾</w:t>
+                  <w:t xml:space="preserve">Ran / tested the code or simulation</w:t>
                 </w:r>
               </w:sdtContent>
             </w:sdt>
@@ -10795,7 +11403,7 @@
                     <w:sz w:val="14"/>
                     <w:szCs w:val="14"/>
                   </w:rPr>
-                  <w:t xml:space="preserve">type here</w:t>
+                  <w:t xml:space="preserve">GPU stayed ~20 % (bursts to 100 % only in updates); SB3 warns MLP-PPO is CPU-bound (SB3 issue #1245). Measured ~490 steps/s with 22 CPU envs: stage 3 (3 M steps) took 104 min. MuJoCo on the CPU sets the speed.</w:t>
                 </w:r>
               </w:sdtContent>
             </w:sdt>
@@ -10837,7 +11445,7 @@
                     <w:sz w:val="14"/>
                     <w:szCs w:val="14"/>
                   </w:rPr>
-                  <w:t xml:space="preserve">Select ▾</w:t>
+                  <w:t xml:space="preserve">Wrong number or statistic</w:t>
                 </w:r>
               </w:sdtContent>
             </w:sdt>
@@ -10874,7 +11482,7 @@
                     <w:sz w:val="14"/>
                     <w:szCs w:val="14"/>
                   </w:rPr>
-                  <w:t xml:space="preserve">Select ▾</w:t>
+                  <w:t xml:space="preserve">Corrected</w:t>
                 </w:r>
               </w:sdtContent>
             </w:sdt>
@@ -10940,7 +11548,7 @@
                     <w:sz w:val="14"/>
                     <w:szCs w:val="14"/>
                   </w:rPr>
-                  <w:t xml:space="preserve">Select ▾</w:t>
+                  <w:t xml:space="preserve">Claude</w:t>
                 </w:r>
               </w:sdtContent>
             </w:sdt>
@@ -10971,7 +11579,7 @@
                     <w:sz w:val="14"/>
                     <w:szCs w:val="14"/>
                   </w:rPr>
-                  <w:t xml:space="preserve">type here</w:t>
+                  <w:t xml:space="preserve">Claude's first canister-centring law set the drone target = marker − (low-passed canister offset) to put the canister over the marker.</w:t>
                 </w:r>
               </w:sdtContent>
             </w:sdt>
@@ -11011,7 +11619,7 @@
                     <w:sz w:val="14"/>
                     <w:szCs w:val="14"/>
                   </w:rPr>
-                  <w:t xml:space="preserve">Select ▾</w:t>
+                  <w:t xml:space="preserve">Ran / tested the code or simulation</w:t>
                 </w:r>
               </w:sdtContent>
             </w:sdt>
@@ -11042,7 +11650,7 @@
                     <w:sz w:val="14"/>
                     <w:szCs w:val="14"/>
                   </w:rPr>
-                  <w:t xml:space="preserve">type here</w:t>
+                  <w:t xml:space="preserve">At 15 m/s the loop fed the swing back into the reference and oscillated (offset grew to 9 m, release never possible). Replaced by a slow integral shift on the canister error (0.35 s⁻¹) + anti-sway; checked in the viewer.</w:t>
                 </w:r>
               </w:sdtContent>
             </w:sdt>
@@ -11083,7 +11691,7 @@
                     <w:sz w:val="14"/>
                     <w:szCs w:val="14"/>
                   </w:rPr>
-                  <w:t xml:space="preserve">Select ▾</w:t>
+                  <w:t xml:space="preserve">Wrong physics / equation</w:t>
                 </w:r>
               </w:sdtContent>
             </w:sdt>
@@ -11119,7 +11727,7 @@
                     <w:sz w:val="14"/>
                     <w:szCs w:val="14"/>
                   </w:rPr>
-                  <w:t xml:space="preserve">Select ▾</w:t>
+                  <w:t xml:space="preserve">Corrected</w:t>
                 </w:r>
               </w:sdtContent>
             </w:sdt>

</xml_diff>

<commit_message>
feat(group-08): completed dossier, video links and telemetry update (PR #4)
</commit_message>
<xml_diff>
--- a/Group_08_Manikya_Shourya_Keswani_Vora/docs/MDRIIA_Group_08_Technical_Dossier.docx
+++ b/Group_08_Manikya_Shourya_Keswani_Vora/docs/MDRIIA_Group_08_Technical_Dossier.docx
@@ -7047,7 +7047,7 @@
                     <w:sz w:val="14"/>
                     <w:szCs w:val="14"/>
                   </w:rPr>
-                  <w:t xml:space="preserve">power model in the loop; ABORT/RTB if predicted SoC at the pad &lt; 25 % (--battery-soc 0.3 demo)</w:t>
+                  <w:t xml:space="preserve">power model in the loop; ABORT/RTB if predicted SoC at the pad &lt; 25 % (--battery-soc 0.27 demo)</w:t>
                 </w:r>
               </w:sdtContent>
             </w:sdt>
@@ -10520,7 +10520,7 @@
                     <w:sz w:val="15"/>
                     <w:szCs w:val="15"/>
                   </w:rPr>
-                  <w:t xml:space="preserve">type here</w:t>
+                  <w:t xml:space="preserve">https://lnkd.in/p/dwu8AHcT</w:t>
                 </w:r>
               </w:sdtContent>
             </w:sdt>
@@ -10579,7 +10579,7 @@
                     <w:sz w:val="15"/>
                     <w:szCs w:val="15"/>
                   </w:rPr>
-                  <w:t xml:space="preserve">type here</w:t>
+                  <w:t xml:space="preserve">3:45</w:t>
                 </w:r>
               </w:sdtContent>
             </w:sdt>
@@ -10642,7 +10642,7 @@
                     <w:sz w:val="15"/>
                     <w:szCs w:val="15"/>
                   </w:rPr>
-                  <w:t xml:space="preserve">Select ▾</w:t>
+                  <w:t xml:space="preserve">Yes</w:t>
                 </w:r>
               </w:sdtContent>
             </w:sdt>
@@ -10705,7 +10705,7 @@
                     <w:sz w:val="15"/>
                     <w:szCs w:val="15"/>
                   </w:rPr>
-                  <w:t xml:space="preserve">Select ▾</w:t>
+                  <w:t xml:space="preserve">Yes</w:t>
                 </w:r>
               </w:sdtContent>
             </w:sdt>
@@ -10766,7 +10766,7 @@
                     <w:sz w:val="15"/>
                     <w:szCs w:val="15"/>
                   </w:rPr>
-                  <w:t xml:space="preserve">Select ▾</w:t>
+                  <w:t xml:space="preserve">Yes</w:t>
                 </w:r>
               </w:sdtContent>
             </w:sdt>
@@ -12011,7 +12011,7 @@
                     <w:sz w:val="14"/>
                     <w:szCs w:val="14"/>
                   </w:rPr>
-                  <w:t xml:space="preserve">Select ▾</w:t>
+                  <w:t xml:space="preserve">2</w:t>
                 </w:r>
               </w:sdtContent>
             </w:sdt>
@@ -12048,7 +12048,7 @@
                     <w:sz w:val="14"/>
                     <w:szCs w:val="14"/>
                   </w:rPr>
-                  <w:t xml:space="preserve">Select ▾</w:t>
+                  <w:t xml:space="preserve">2</w:t>
                 </w:r>
               </w:sdtContent>
             </w:sdt>
@@ -12085,7 +12085,7 @@
                     <w:sz w:val="14"/>
                     <w:szCs w:val="14"/>
                   </w:rPr>
-                  <w:t xml:space="preserve">Select ▾</w:t>
+                  <w:t xml:space="preserve">2</w:t>
                 </w:r>
               </w:sdtContent>
             </w:sdt>
@@ -12122,7 +12122,7 @@
                     <w:sz w:val="14"/>
                     <w:szCs w:val="14"/>
                   </w:rPr>
-                  <w:t xml:space="preserve">Select ▾</w:t>
+                  <w:t xml:space="preserve">2</w:t>
                 </w:r>
               </w:sdtContent>
             </w:sdt>
@@ -12159,7 +12159,7 @@
                     <w:sz w:val="14"/>
                     <w:szCs w:val="14"/>
                   </w:rPr>
-                  <w:t xml:space="preserve">Select ▾</w:t>
+                  <w:t xml:space="preserve">2</w:t>
                 </w:r>
               </w:sdtContent>
             </w:sdt>
@@ -12191,7 +12191,7 @@
                     <w:sz w:val="14"/>
                     <w:szCs w:val="14"/>
                   </w:rPr>
-                  <w:t xml:space="preserve">type here</w:t>
+                  <w:t xml:space="preserve">0:20–1:40 · live MuJoCo run: the UGV replans around high-cost cells of its LiDAR traversability map on rough terrain</w:t>
                 </w:r>
               </w:sdtContent>
             </w:sdt>
@@ -12223,7 +12223,7 @@
                     <w:sz w:val="14"/>
                     <w:szCs w:val="14"/>
                   </w:rPr>
-                  <w:t xml:space="preserve">type here</w:t>
+                  <w:t xml:space="preserve">How did you choose the slope vs roughness weights in your traversability cost, and how much does skid-steer wheel slip on loose rubble (MuJoCo friction) move the UGV off the planned path?</w:t>
                 </w:r>
               </w:sdtContent>
             </w:sdt>
@@ -12285,7 +12285,7 @@
                     <w:sz w:val="14"/>
                     <w:szCs w:val="14"/>
                   </w:rPr>
-                  <w:t xml:space="preserve">Select ▾</w:t>
+                  <w:t xml:space="preserve">2</w:t>
                 </w:r>
               </w:sdtContent>
             </w:sdt>
@@ -12321,7 +12321,7 @@
                     <w:sz w:val="14"/>
                     <w:szCs w:val="14"/>
                   </w:rPr>
-                  <w:t xml:space="preserve">Select ▾</w:t>
+                  <w:t xml:space="preserve">2</w:t>
                 </w:r>
               </w:sdtContent>
             </w:sdt>
@@ -12357,7 +12357,7 @@
                     <w:sz w:val="14"/>
                     <w:szCs w:val="14"/>
                   </w:rPr>
-                  <w:t xml:space="preserve">Select ▾</w:t>
+                  <w:t xml:space="preserve">2</w:t>
                 </w:r>
               </w:sdtContent>
             </w:sdt>
@@ -12393,7 +12393,7 @@
                     <w:sz w:val="14"/>
                     <w:szCs w:val="14"/>
                   </w:rPr>
-                  <w:t xml:space="preserve">Select ▾</w:t>
+                  <w:t xml:space="preserve">2</w:t>
                 </w:r>
               </w:sdtContent>
             </w:sdt>
@@ -12429,7 +12429,7 @@
                     <w:sz w:val="14"/>
                     <w:szCs w:val="14"/>
                   </w:rPr>
-                  <w:t xml:space="preserve">Select ▾</w:t>
+                  <w:t xml:space="preserve">2</w:t>
                 </w:r>
               </w:sdtContent>
             </w:sdt>
@@ -12460,7 +12460,7 @@
                     <w:sz w:val="14"/>
                     <w:szCs w:val="14"/>
                   </w:rPr>
-                  <w:t xml:space="preserve">type here</w:t>
+                  <w:t xml:space="preserve">0:20–1:40 · live MuJoCo run: the companion robot detects the fall from the MediaPipe pose and raises the alert</w:t>
                 </w:r>
               </w:sdtContent>
             </w:sdt>
@@ -12491,7 +12491,7 @@
                     <w:sz w:val="14"/>
                     <w:szCs w:val="14"/>
                   </w:rPr>
-                  <w:t xml:space="preserve">type here</w:t>
+                  <w:t xml:space="preserve">What is your false-alarm rate when a person simply lies down to rest, and how do false alarms change your dispatch-latency result and the cost model?</w:t>
                 </w:r>
               </w:sdtContent>
             </w:sdt>
@@ -12797,7 +12797,7 @@
                     <w:sz w:val="14"/>
                     <w:szCs w:val="14"/>
                   </w:rPr>
-                  <w:t xml:space="preserve">type here</w:t>
+                  <w:t xml:space="preserve">60</w:t>
                 </w:r>
               </w:sdtContent>
             </w:sdt>
@@ -12836,7 +12836,7 @@
                     <w:sz w:val="14"/>
                     <w:szCs w:val="14"/>
                   </w:rPr>
-                  <w:t xml:space="preserve">Select ▾</w:t>
+                  <w:t xml:space="preserve">5</w:t>
                 </w:r>
               </w:sdtContent>
             </w:sdt>
@@ -12872,7 +12872,7 @@
                     <w:sz w:val="14"/>
                     <w:szCs w:val="14"/>
                   </w:rPr>
-                  <w:t xml:space="preserve">Select ▾</w:t>
+                  <w:t xml:space="preserve">Yes</w:t>
                 </w:r>
               </w:sdtContent>
             </w:sdt>
@@ -12904,7 +12904,7 @@
                     <w:sz w:val="14"/>
                     <w:szCs w:val="14"/>
                   </w:rPr>
-                  <w:t xml:space="preserve">type here</w:t>
+                  <w:t xml:space="preserve">models/skyhydro_flood_uav.xml, simulate.py, environment/, rl/, train_all.py</w:t>
                 </w:r>
               </w:sdtContent>
             </w:sdt>
@@ -12936,7 +12936,7 @@
                     <w:sz w:val="14"/>
                     <w:szCs w:val="14"/>
                   </w:rPr>
-                  <w:t xml:space="preserve">type here</w:t>
+                  <w:t xml:space="preserve">100 % (1 of 1 commits in the folder, team PR #1)</w:t>
                 </w:r>
               </w:sdtContent>
             </w:sdt>
@@ -12974,7 +12974,7 @@
                     <w:sz w:val="14"/>
                     <w:szCs w:val="14"/>
                   </w:rPr>
-                  <w:t xml:space="preserve">Select ▾</w:t>
+                  <w:t xml:space="preserve">76–100 %</w:t>
                 </w:r>
               </w:sdtContent>
             </w:sdt>
@@ -13012,7 +13012,7 @@
                     <w:sz w:val="14"/>
                     <w:szCs w:val="14"/>
                   </w:rPr>
-                  <w:t xml:space="preserve">Select ▾</w:t>
+                  <w:t xml:space="preserve">3–5</w:t>
                 </w:r>
               </w:sdtContent>
             </w:sdt>
@@ -13071,7 +13071,7 @@
                     <w:sz w:val="14"/>
                     <w:szCs w:val="14"/>
                   </w:rPr>
-                  <w:t xml:space="preserve">type here</w:t>
+                  <w:t xml:space="preserve">20</w:t>
                 </w:r>
               </w:sdtContent>
             </w:sdt>
@@ -13110,7 +13110,7 @@
                     <w:sz w:val="14"/>
                     <w:szCs w:val="14"/>
                   </w:rPr>
-                  <w:t xml:space="preserve">Select ▾</w:t>
+                  <w:t xml:space="preserve">4</w:t>
                 </w:r>
               </w:sdtContent>
             </w:sdt>
@@ -13146,7 +13146,7 @@
                     <w:sz w:val="14"/>
                     <w:szCs w:val="14"/>
                   </w:rPr>
-                  <w:t xml:space="preserve">Select ▾</w:t>
+                  <w:t xml:space="preserve">Yes</w:t>
                 </w:r>
               </w:sdtContent>
             </w:sdt>
@@ -13178,7 +13178,7 @@
                     <w:sz w:val="14"/>
                     <w:szCs w:val="14"/>
                   </w:rPr>
-                  <w:t xml:space="preserve">type here</w:t>
+                  <w:t xml:space="preserve">src/flood_relief_drop_sim.py (FSM, vision-guided release)</w:t>
                 </w:r>
               </w:sdtContent>
             </w:sdt>
@@ -13210,7 +13210,7 @@
                     <w:sz w:val="14"/>
                     <w:szCs w:val="14"/>
                   </w:rPr>
-                  <w:t xml:space="preserve">type here</w:t>
+                  <w:t xml:space="preserve">0 % (work merged through the team PR #1)</w:t>
                 </w:r>
               </w:sdtContent>
             </w:sdt>
@@ -13248,7 +13248,7 @@
                     <w:sz w:val="14"/>
                     <w:szCs w:val="14"/>
                   </w:rPr>
-                  <w:t xml:space="preserve">Select ▾</w:t>
+                  <w:t xml:space="preserve">76–100 %</w:t>
                 </w:r>
               </w:sdtContent>
             </w:sdt>
@@ -13286,7 +13286,7 @@
                     <w:sz w:val="14"/>
                     <w:szCs w:val="14"/>
                   </w:rPr>
-                  <w:t xml:space="preserve">Select ▾</w:t>
+                  <w:t xml:space="preserve">1–2</w:t>
                 </w:r>
               </w:sdtContent>
             </w:sdt>
@@ -13345,7 +13345,7 @@
                     <w:sz w:val="14"/>
                     <w:szCs w:val="14"/>
                   </w:rPr>
-                  <w:t xml:space="preserve">type here</w:t>
+                  <w:t xml:space="preserve">20</w:t>
                 </w:r>
               </w:sdtContent>
             </w:sdt>
@@ -13384,7 +13384,7 @@
                     <w:sz w:val="14"/>
                     <w:szCs w:val="14"/>
                   </w:rPr>
-                  <w:t xml:space="preserve">Select ▾</w:t>
+                  <w:t xml:space="preserve">4</w:t>
                 </w:r>
               </w:sdtContent>
             </w:sdt>
@@ -13420,7 +13420,7 @@
                     <w:sz w:val="14"/>
                     <w:szCs w:val="14"/>
                   </w:rPr>
-                  <w:t xml:space="preserve">Select ▾</w:t>
+                  <w:t xml:space="preserve">Yes</w:t>
                 </w:r>
               </w:sdtContent>
             </w:sdt>
@@ -13452,7 +13452,7 @@
                     <w:sz w:val="14"/>
                     <w:szCs w:val="14"/>
                   </w:rPr>
-                  <w:t xml:space="preserve">type here</w:t>
+                  <w:t xml:space="preserve">analytics/analyze_trials.py, analytics/evaluate_rl_pilot.py</w:t>
                 </w:r>
               </w:sdtContent>
             </w:sdt>
@@ -13484,7 +13484,7 @@
                     <w:sz w:val="14"/>
                     <w:szCs w:val="14"/>
                   </w:rPr>
-                  <w:t xml:space="preserve">type here</w:t>
+                  <w:t xml:space="preserve">0 % (work merged through the team PR #1)</w:t>
                 </w:r>
               </w:sdtContent>
             </w:sdt>
@@ -13522,7 +13522,7 @@
                     <w:sz w:val="14"/>
                     <w:szCs w:val="14"/>
                   </w:rPr>
-                  <w:t xml:space="preserve">Select ▾</w:t>
+                  <w:t xml:space="preserve">76–100 %</w:t>
                 </w:r>
               </w:sdtContent>
             </w:sdt>
@@ -13560,7 +13560,7 @@
                     <w:sz w:val="14"/>
                     <w:szCs w:val="14"/>
                   </w:rPr>
-                  <w:t xml:space="preserve">Select ▾</w:t>
+                  <w:t xml:space="preserve">1–2</w:t>
                 </w:r>
               </w:sdtContent>
             </w:sdt>
@@ -13617,7 +13617,7 @@
                     <w:sz w:val="14"/>
                     <w:szCs w:val="14"/>
                   </w:rPr>
-                  <w:t xml:space="preserve">type here</w:t>
+                  <w:t xml:space="preserve">20</w:t>
                 </w:r>
               </w:sdtContent>
             </w:sdt>
@@ -13655,7 +13655,7 @@
                     <w:sz w:val="14"/>
                     <w:szCs w:val="14"/>
                   </w:rPr>
-                  <w:t xml:space="preserve">Select ▾</w:t>
+                  <w:t xml:space="preserve">4</w:t>
                 </w:r>
               </w:sdtContent>
             </w:sdt>
@@ -13690,7 +13690,7 @@
                     <w:sz w:val="14"/>
                     <w:szCs w:val="14"/>
                   </w:rPr>
-                  <w:t xml:space="preserve">Select ▾</w:t>
+                  <w:t xml:space="preserve">Yes</w:t>
                 </w:r>
               </w:sdtContent>
             </w:sdt>
@@ -13721,7 +13721,7 @@
                     <w:sz w:val="14"/>
                     <w:szCs w:val="14"/>
                   </w:rPr>
-                  <w:t xml:space="preserve">type here</w:t>
+                  <w:t xml:space="preserve">analytics/disaster_relief_logistics.py</w:t>
                 </w:r>
               </w:sdtContent>
             </w:sdt>
@@ -13752,7 +13752,7 @@
                     <w:sz w:val="14"/>
                     <w:szCs w:val="14"/>
                   </w:rPr>
-                  <w:t xml:space="preserve">type here</w:t>
+                  <w:t xml:space="preserve">0 % (work merged through the team PR #1)</w:t>
                 </w:r>
               </w:sdtContent>
             </w:sdt>
@@ -13789,7 +13789,7 @@
                     <w:sz w:val="14"/>
                     <w:szCs w:val="14"/>
                   </w:rPr>
-                  <w:t xml:space="preserve">Select ▾</w:t>
+                  <w:t xml:space="preserve">76–100 %</w:t>
                 </w:r>
               </w:sdtContent>
             </w:sdt>
@@ -13826,7 +13826,7 @@
                     <w:sz w:val="14"/>
                     <w:szCs w:val="14"/>
                   </w:rPr>
-                  <w:t xml:space="preserve">Select ▾</w:t>
+                  <w:t xml:space="preserve">1–2</w:t>
                 </w:r>
               </w:sdtContent>
             </w:sdt>
@@ -14002,7 +14002,7 @@
                     <w:sz w:val="14"/>
                     <w:szCs w:val="14"/>
                   </w:rPr>
-                  <w:t xml:space="preserve">Select ▾</w:t>
+                  <w:t xml:space="preserve">Yes</w:t>
                 </w:r>
               </w:sdtContent>
             </w:sdt>
@@ -14034,7 +14034,7 @@
                     <w:sz w:val="14"/>
                     <w:szCs w:val="14"/>
                   </w:rPr>
-                  <w:t xml:space="preserve">type here</w:t>
+                  <w:t xml:space="preserve">Testing every AI claim by running it: the GPU-speed and memory claims only failed on the real lab PC.</w:t>
                 </w:r>
               </w:sdtContent>
             </w:sdt>
@@ -14066,7 +14066,7 @@
                     <w:sz w:val="14"/>
                     <w:szCs w:val="14"/>
                   </w:rPr>
-                  <w:t xml:space="preserve">type here</w:t>
+                  <w:t xml:space="preserve">Give lab-PC access and a sample MuJoCo project in the first week so setup problems show up early.</w:t>
                 </w:r>
               </w:sdtContent>
             </w:sdt>
@@ -14129,7 +14129,7 @@
                     <w:sz w:val="14"/>
                     <w:szCs w:val="14"/>
                   </w:rPr>
-                  <w:t xml:space="preserve">Select ▾</w:t>
+                  <w:t xml:space="preserve">No</w:t>
                 </w:r>
               </w:sdtContent>
             </w:sdt>
@@ -14161,7 +14161,7 @@
                     <w:sz w:val="14"/>
                     <w:szCs w:val="14"/>
                   </w:rPr>
-                  <w:t xml:space="preserve">type here</w:t>
+                  <w:t xml:space="preserve">How a state machine plus cascaded PID makes a drone hover and release a swinging load safely.</w:t>
                 </w:r>
               </w:sdtContent>
             </w:sdt>
@@ -14193,7 +14193,7 @@
                     <w:sz w:val="14"/>
                     <w:szCs w:val="14"/>
                   </w:rPr>
-                  <w:t xml:space="preserve">type here</w:t>
+                  <w:t xml:space="preserve">One lab session on MuJoCo actuators and the viewer before the capstone starts.</w:t>
                 </w:r>
               </w:sdtContent>
             </w:sdt>
@@ -14256,7 +14256,7 @@
                     <w:sz w:val="14"/>
                     <w:szCs w:val="14"/>
                   </w:rPr>
-                  <w:t xml:space="preserve">Select ▾</w:t>
+                  <w:t xml:space="preserve">No</w:t>
                 </w:r>
               </w:sdtContent>
             </w:sdt>
@@ -14288,7 +14288,7 @@
                     <w:sz w:val="14"/>
                     <w:szCs w:val="14"/>
                   </w:rPr>
-                  <w:t xml:space="preserve">type here</w:t>
+                  <w:t xml:space="preserve">Designing paired-seed Monte Carlo trials and reading Welch's t-test and Cohen's d correctly.</w:t>
                 </w:r>
               </w:sdtContent>
             </w:sdt>
@@ -14320,7 +14320,7 @@
                     <w:sz w:val="14"/>
                     <w:szCs w:val="14"/>
                   </w:rPr>
-                  <w:t xml:space="preserve">type here</w:t>
+                  <w:t xml:space="preserve">A worked example of the statistics section earlier in the semester.</w:t>
                 </w:r>
               </w:sdtContent>
             </w:sdt>
@@ -14381,7 +14381,7 @@
                     <w:sz w:val="14"/>
                     <w:szCs w:val="14"/>
                   </w:rPr>
-                  <w:t xml:space="preserve">Select ▾</w:t>
+                  <w:t xml:space="preserve">No</w:t>
                 </w:r>
               </w:sdtContent>
             </w:sdt>
@@ -14412,7 +14412,7 @@
                     <w:sz w:val="14"/>
                     <w:szCs w:val="14"/>
                   </w:rPr>
-                  <w:t xml:space="preserve">type here</w:t>
+                  <w:t xml:space="preserve">Building a dimensionless cost model and showing with a sensitivity graph where the conclusion breaks.</w:t>
                 </w:r>
               </w:sdtContent>
             </w:sdt>
@@ -14443,7 +14443,7 @@
                     <w:sz w:val="14"/>
                     <w:szCs w:val="14"/>
                   </w:rPr>
-                  <w:t xml:space="preserve">type here</w:t>
+                  <w:t xml:space="preserve">More time between the trial data and the business model deadline.</w:t>
                 </w:r>
               </w:sdtContent>
             </w:sdt>
@@ -15026,7 +15026,7 @@
                     <w:sz w:val="15"/>
                     <w:szCs w:val="15"/>
                   </w:rPr>
-                  <w:t xml:space="preserve">Select ▾</w:t>
+                  <w:t xml:space="preserve">Yes</w:t>
                 </w:r>
               </w:sdtContent>
             </w:sdt>
@@ -15062,7 +15062,7 @@
                     <w:sz w:val="15"/>
                     <w:szCs w:val="15"/>
                   </w:rPr>
-                  <w:t xml:space="preserve">Select ▾</w:t>
+                  <w:t xml:space="preserve">Yes</w:t>
                 </w:r>
               </w:sdtContent>
             </w:sdt>
@@ -15098,7 +15098,7 @@
                     <w:sz w:val="15"/>
                     <w:szCs w:val="15"/>
                   </w:rPr>
-                  <w:t xml:space="preserve">Select ▾</w:t>
+                  <w:t xml:space="preserve">Yes</w:t>
                 </w:r>
               </w:sdtContent>
             </w:sdt>
@@ -15112,6 +15112,12 @@
             <w:pPr>
               <w:keepNext/>
             </w:pPr>
+            <w:r>
+              <w:rPr>
+                <w:i/>
+              </w:rPr>
+              <w:t>Manikya Rathore</w:t>
+            </w:r>
           </w:p>
         </w:tc>
         <w:tc>
@@ -15144,7 +15150,7 @@
                     <w:sz w:val="15"/>
                     <w:szCs w:val="15"/>
                   </w:rPr>
-                  <w:t xml:space="preserve">Select ▾</w:t>
+                  <w:t xml:space="preserve">Yes</w:t>
                 </w:r>
               </w:sdtContent>
             </w:sdt>
@@ -15207,7 +15213,7 @@
                     <w:sz w:val="15"/>
                     <w:szCs w:val="15"/>
                   </w:rPr>
-                  <w:t xml:space="preserve">Select ▾</w:t>
+                  <w:t xml:space="preserve">Yes</w:t>
                 </w:r>
               </w:sdtContent>
             </w:sdt>
@@ -15243,7 +15249,7 @@
                     <w:sz w:val="15"/>
                     <w:szCs w:val="15"/>
                   </w:rPr>
-                  <w:t xml:space="preserve">Select ▾</w:t>
+                  <w:t xml:space="preserve">Yes</w:t>
                 </w:r>
               </w:sdtContent>
             </w:sdt>
@@ -15279,7 +15285,7 @@
                     <w:sz w:val="15"/>
                     <w:szCs w:val="15"/>
                   </w:rPr>
-                  <w:t xml:space="preserve">Select ▾</w:t>
+                  <w:t xml:space="preserve">Yes</w:t>
                 </w:r>
               </w:sdtContent>
             </w:sdt>
@@ -15293,6 +15299,12 @@
             <w:pPr>
               <w:keepNext/>
             </w:pPr>
+            <w:r>
+              <w:rPr>
+                <w:i/>
+              </w:rPr>
+              <w:t>Shourya Garg</w:t>
+            </w:r>
           </w:p>
         </w:tc>
         <w:tc>
@@ -15325,7 +15337,7 @@
                     <w:sz w:val="15"/>
                     <w:szCs w:val="15"/>
                   </w:rPr>
-                  <w:t xml:space="preserve">Select ▾</w:t>
+                  <w:t xml:space="preserve">Yes</w:t>
                 </w:r>
               </w:sdtContent>
             </w:sdt>
@@ -15388,7 +15400,7 @@
                     <w:sz w:val="15"/>
                     <w:szCs w:val="15"/>
                   </w:rPr>
-                  <w:t xml:space="preserve">Select ▾</w:t>
+                  <w:t xml:space="preserve">Yes</w:t>
                 </w:r>
               </w:sdtContent>
             </w:sdt>
@@ -15424,7 +15436,7 @@
                     <w:sz w:val="15"/>
                     <w:szCs w:val="15"/>
                   </w:rPr>
-                  <w:t xml:space="preserve">Select ▾</w:t>
+                  <w:t xml:space="preserve">Yes</w:t>
                 </w:r>
               </w:sdtContent>
             </w:sdt>
@@ -15460,7 +15472,7 @@
                     <w:sz w:val="15"/>
                     <w:szCs w:val="15"/>
                   </w:rPr>
-                  <w:t xml:space="preserve">Select ▾</w:t>
+                  <w:t xml:space="preserve">Yes</w:t>
                 </w:r>
               </w:sdtContent>
             </w:sdt>
@@ -15474,6 +15486,12 @@
             <w:pPr>
               <w:keepNext/>
             </w:pPr>
+            <w:r>
+              <w:rPr>
+                <w:i/>
+              </w:rPr>
+              <w:t>Keswani Laksh</w:t>
+            </w:r>
           </w:p>
         </w:tc>
         <w:tc>
@@ -15506,7 +15524,7 @@
                     <w:sz w:val="15"/>
                     <w:szCs w:val="15"/>
                   </w:rPr>
-                  <w:t xml:space="preserve">Select ▾</w:t>
+                  <w:t xml:space="preserve">Yes</w:t>
                 </w:r>
               </w:sdtContent>
             </w:sdt>
@@ -15567,7 +15585,7 @@
                     <w:sz w:val="15"/>
                     <w:szCs w:val="15"/>
                   </w:rPr>
-                  <w:t xml:space="preserve">Select ▾</w:t>
+                  <w:t xml:space="preserve">Yes</w:t>
                 </w:r>
               </w:sdtContent>
             </w:sdt>
@@ -15602,7 +15620,7 @@
                     <w:sz w:val="15"/>
                     <w:szCs w:val="15"/>
                   </w:rPr>
-                  <w:t xml:space="preserve">Select ▾</w:t>
+                  <w:t xml:space="preserve">Yes</w:t>
                 </w:r>
               </w:sdtContent>
             </w:sdt>
@@ -15637,7 +15655,7 @@
                     <w:sz w:val="15"/>
                     <w:szCs w:val="15"/>
                   </w:rPr>
-                  <w:t xml:space="preserve">Select ▾</w:t>
+                  <w:t xml:space="preserve">Yes</w:t>
                 </w:r>
               </w:sdtContent>
             </w:sdt>
@@ -15647,7 +15665,14 @@
           <w:tcPr>
             <w:tcW w:type="dxa" w:w="2211"/>
           </w:tcPr>
-          <w:p/>
+          <w:p>
+            <w:r>
+              <w:rPr>
+                <w:i/>
+              </w:rPr>
+              <w:t>Vora Jash</w:t>
+            </w:r>
+          </w:p>
         </w:tc>
         <w:tc>
           <w:tcPr>
@@ -15678,7 +15703,7 @@
                     <w:sz w:val="15"/>
                     <w:szCs w:val="15"/>
                   </w:rPr>
-                  <w:t xml:space="preserve">Select ▾</w:t>
+                  <w:t xml:space="preserve">Yes</w:t>
                 </w:r>
               </w:sdtContent>
             </w:sdt>

</xml_diff>